<commit_message>
dealing with Emily's comments
</commit_message>
<xml_diff>
--- a/docs/manuscript/sampling_uncertainty_mpm_main.docx
+++ b/docs/manuscript/sampling_uncertainty_mpm_main.docx
@@ -31,15 +31,6 @@
           <w:vertAlign w:val="superscript"/>
         </w:rPr>
         <w:t xml:space="preserve">1,2</w:t>
-      </w:r>
-      <w:r>
-        <w:t xml:space="preserve">, Patrick Barks</w:t>
-      </w:r>
-      <w:r>
-        <w:rPr>
-          <w:vertAlign w:val="superscript"/>
-        </w:rPr>
-        <w:t xml:space="preserve">1</w:t>
       </w:r>
       <w:r>
         <w:t xml:space="preserve">, Emily G. Simmonds</w:t>
@@ -203,7 +194,7 @@
         <w:pStyle w:val="FirstParagraph"/>
       </w:pPr>
       <w:r>
-        <w:t xml:space="preserve">The collation of published demographic data in databases such as PanTHERIA (Jones et al. 2009), AnAge (de Magalhães and Costa 2009), Myhrvold et al.’s (2015) amniote life history database, and COM(P)ADRE (Salguero-Gómez et al. 2015, Salguero-Gómez et al. 2016a) has facilitated fascinating comparative analyses in ecology, evolution, and demography (e.g. Garratt et al. 2013, Adler et al. 2014, Healy et al. 2014, Fristoe et al. 2017). By leveraging open-source databases that combine data from hundreds of individual studies, researchers can test hypotheses of interest at taxonomic, spatial, and temporal scales that would otherwise be impossible. However, analysing</w:t>
+        <w:t xml:space="preserve">The collation of published demographic data in databases such as PanTHERIA (Jones et al. 2009), AnAge (de Magalhães and Costa 2009), Myhrvold et al.’s (2015) amniote life history database, and COM(P)ADRE (Salguero-Gómez et al. 2015, Salguero-Gómez et al. 2016a) has enabled fascinating comparative analyses in ecology, evolution, and demography (e.g. Garratt et al. 2013, Adler et al. 2014, Healy et al. 2014, Fristoe et al. 2017). By leveraging open-source databases that aggregate data from hundreds of individual studies, researchers can test hypotheses of interest across taxonomic, spatial, and temporal scales that would otherwise be impossible. However, analysing</w:t>
       </w:r>
       <w:r>
         <w:t xml:space="preserve"> </w:t>
@@ -223,7 +214,7 @@
         <w:pStyle w:val="BodyText"/>
       </w:pPr>
       <w:r>
-        <w:t xml:space="preserve">One challenge in working with large collections of published data is understanding and modelling the sources of underlying uncertainty. For instance, the demographic parameters reported in the databases noted above have almost always been estimated from a sample of individuals from a larger population of interest, and therefore carry inherent sampling uncertainty. However, parameter-specific sample sizes and standard errors are rarely available and are often difficult to obtain even from the original data sources. These original studies, which produce the parameter estimates later compiled in demographic databases, almost always account for sampling uncertainty in their own analyses. However, studies that subsequently analyse parameter estimates compiled in demographic databases rarely account for uncertainty in those estimates, raising questions about the robustness of inferences drawn from such analyses (Biggs et al. 2009).</w:t>
+        <w:t xml:space="preserve">One challenge in working with large collections of published data is understanding and modelling the sources of underlying uncertainty. For instance, the demographic parameters reported in the databases noted above have almost always been estimated from a sample of individuals drawn from a larger population of interest, and therefore carry inherent sampling uncertainty. However, parameter-specific sample sizes and standard errors are rarely available and are often difficult to obtain even from the original data sources. These original studies, which produce the parameter estimates later compiled in demographic databases, almost always account for sampling uncertainty in their own analyses. However, studies that subsequently analyse parameter estimates compiled in demographic databases rarely account for uncertainty in those estimates, raising questions about the robustness of inferences drawn from such analyses (Biggs et al. 2009).</w:t>
       </w:r>
     </w:p>
     <w:p>
@@ -255,11 +246,11 @@
         <w:pStyle w:val="BodyText"/>
       </w:pPr>
       <w:r>
-        <w:t xml:space="preserve">Our aim is to examine, through two contrasting analyses, how sampling uncertainty in published projection matrices propagates to commonly used MPM-derived traits, and to explore conditions under which point estimates may be robust or fragile. Rather than a comprehensive assessment across all possible traits and study designs, we use these analyses to illustrate the trait-dependent nature of uncertainty effects and to identify diagnostic features that may help researchers assess robustness in their own work. Although sample sizes are not reported in COMPADRE, anecdotal evidence suggests that some transition rates have been estimated from very small samples, in some cases from as few as a single individual. Using a subset of studies for which transition-specific sample sizes or equivalent information could be obtained, we examine how sampling uncertainty propagates to a selection of MPM-derived traits across two analyses, and consider what these results suggest about the conditions under which such uncertainty warrants explicit attention.</w:t>
+        <w:t xml:space="preserve">Our aim is to examine how sampling uncertainty in published projection matrices propagates to specific MPM-derived quantities and to explore when point estimates are robust or fragile. The focal quantities are mature life expectancy, the shape of the mortality trajectory, the log population growth rate, and recruitment-climate regression coefficients. Because COMPADRE does not routinely include the transition-level sample-size information needed for uncertainty reconstruction, our analysis is restricted to the subset for which these data could be assembled (325 MPMs from 33 studies; details in Methods). We illustrate trait-dependent uncertainty effects using two analyses, a multi-species comparative analysis of life expectancy-shape relationships and a single-species time-series analysis of weather effects on recruitment. Through these analyses, we identify diagnostic features that help researchers assess robustness in their own work and clarify when explicit uncertainty propagation is likely to matter. Because most published plant MPMs are stage-structured rather than age-structured, many demographic quantities of biological interest (e.g. life expectancy and mortality shape) are inferred indirectly from stage transitions. This stage-to-age mapping can amplify the effects of sampling uncertainty, particularly for traits that depend on long-term survivorship.</w:t>
       </w:r>
     </w:p>
     <w:bookmarkEnd w:id="25"/>
-    <w:bookmarkStart w:id="32" w:name="methods"/>
+    <w:bookmarkStart w:id="34" w:name="methods"/>
     <w:p>
       <w:pPr>
         <w:pStyle w:val="Heading1"/>
@@ -312,7 +303,7 @@
         <w:pStyle w:val="FirstParagraph"/>
       </w:pPr>
       <w:r>
-        <w:t xml:space="preserve">We used the COMPADRE database to identify an initial group of 91 studies from which we sought to obtain data. The initial search criteria were: studies published from 2010 onward; species of common perennial growth types (herbaceous, shrub, tree, palm, and succulent); wild populations not subject to any experimental treatment; and MPMs with three or more stage classes and a projection interval of one year. Of the 91 studies that met our initial criteria, we obtained the data necessary to model sampling uncertainty for 28, representing a total of 298 MPMs for 73 populations of 27 species. We supplemented this set with 5 additional studies published prior to 2010 for which we had previously obtained data (these had been targeted based on a criterion of ≥4 years of temporal replication). Our final set, therefore, included 33 studies, representing 325 MPMs for 82 populations of 32 species.</w:t>
+        <w:t xml:space="preserve">We used the COMPADRE database to identify an initial group of 91 studies from which we sought data. The initial search criteria were: studies published from 2010 onwards; species of common perennial growth forms (herbaceous, shrub, tree, palm, and succulent); wild populations not subjected to experimental treatments; and MPMs with three or more stage classes and a one-year projection interval. Of the 91 studies that met our initial criteria, we obtained the data required to model sampling uncertainty for 28, yielding a total of 298 MPMs for 73 populations of 27 species. We supplemented this set with 5 additional studies published before 2010 for which we had previously obtained data (these had been targeted based on a criterion of ≥4 years of temporal replication). Our final set therefore included 33 studies, representing 325 MPMs for 82 populations of 32 species.</w:t>
       </w:r>
     </w:p>
     <w:bookmarkEnd w:id="27"/>
@@ -463,7 +454,7 @@
         <w:pStyle w:val="BodyText"/>
       </w:pPr>
       <w:r>
-        <w:t xml:space="preserve">The methodology for estimating transition rates varies across studies, but in general, survival-related transitions are estimated directly from observed transition frequencies in a sample of tagged individuals, as in</w:t>
+        <w:t xml:space="preserve">The methodology for estimating transition rates varies across studies, but in general, survival-related transitions are estimated directly from observed transition frequencies in a sample of tagged individuals, as in Eq. (1),</w:t>
       </w:r>
     </w:p>
     <w:p>
@@ -598,6 +589,22 @@
             </m:rPr>
             <m:t>.</m:t>
           </m:r>
+          <m:r>
+            <m:t>  </m:t>
+          </m:r>
+          <m:d>
+            <m:dPr>
+              <m:begChr m:val="("/>
+              <m:sepChr m:val=""/>
+              <m:endChr m:val=")"/>
+              <m:grow/>
+            </m:dPr>
+            <m:e>
+              <m:r>
+                <m:t>1</m:t>
+              </m:r>
+            </m:e>
+          </m:d>
         </m:oMath>
       </m:oMathPara>
     </w:p>
@@ -640,7 +647,7 @@
         </m:r>
       </m:oMath>
       <w:r>
-        <w:t xml:space="preserve">, as in</w:t>
+        <w:t xml:space="preserve">, as in Eq. (2),</w:t>
       </w:r>
     </w:p>
     <w:p>
@@ -746,6 +753,22 @@
             </m:rPr>
             <m:t>.</m:t>
           </m:r>
+          <m:r>
+            <m:t>  </m:t>
+          </m:r>
+          <m:d>
+            <m:dPr>
+              <m:begChr m:val="("/>
+              <m:sepChr m:val=""/>
+              <m:endChr m:val=")"/>
+              <m:grow/>
+            </m:dPr>
+            <m:e>
+              <m:r>
+                <m:t>2</m:t>
+              </m:r>
+            </m:e>
+          </m:d>
         </m:oMath>
       </m:oMathPara>
     </w:p>
@@ -1063,17 +1086,36 @@
         <w:t xml:space="preserve">.</w:t>
       </w:r>
     </w:p>
-    <w:p>
-      <w:pPr>
-        <w:pStyle w:val="BodyText"/>
+    <w:bookmarkEnd w:id="29"/>
+    <w:bookmarkStart w:id="33" w:name="analyses"/>
+    <w:p>
+      <w:pPr>
+        <w:pStyle w:val="Heading2"/>
+      </w:pPr>
+      <w:r>
+        <w:t xml:space="preserve">Analyses</w:t>
+      </w:r>
+    </w:p>
+    <w:p>
+      <w:pPr>
+        <w:pStyle w:val="FirstParagraph"/>
       </w:pPr>
       <w:r>
         <w:t xml:space="preserve">We chose parametric bootstrapping because the sampling distributions of survival and reproductive transitions follow well-characterised probability models (multinomial and Poisson, respectively) whose parameters can be directly estimated from the transition frequencies reported in source studies. This makes parametric bootstrapping more tractable than MCMC for our scale of analysis and more principled than the empirical bootstrap, which cannot generate variation when all individuals in a stage class experience the same outcome (e.g. all survive), a situation common in published matrices.</w:t>
       </w:r>
     </w:p>
-    <w:p>
-      <w:pPr>
-        <w:pStyle w:val="BodyText"/>
+    <w:bookmarkStart w:id="30" w:name="illustrative-example"/>
+    <w:p>
+      <w:pPr>
+        <w:pStyle w:val="Heading3"/>
+      </w:pPr>
+      <w:r>
+        <w:t xml:space="preserve">Illustrative example</w:t>
+      </w:r>
+    </w:p>
+    <w:p>
+      <w:pPr>
+        <w:pStyle w:val="FirstParagraph"/>
       </w:pPr>
       <w:r>
         <w:t xml:space="preserve">We illustrate with an MPM for the perennial forb</w:t>
@@ -2355,7 +2397,7 @@
         <w:pStyle w:val="FirstParagraph"/>
       </w:pPr>
       <w:r>
-        <w:t xml:space="preserve">To create a sampling distribution for the focal MPM, we take 2,000 independent draws from the sampling distributions implied above (see the Supplementary Materials for a more complete description of this workflow). At each iteration, we arrange the drawn transition rates into the form of our MPM and then use that MPM draw to calculate our derived parameter(s) of interest. After 2,000 iterations, we therefore have 2,000 independent draws from the sampling distribution of each transition rate and derived parameter.</w:t>
+        <w:t xml:space="preserve">To create a sampling distribution for the focal MPM, we take 2,000 independent draws from the sampling distributions implied above (see Supplementary Methods section S1.1 for a full workflow description). At each iteration, we arrange the drawn transition rates into the form of our MPM and then use that MPM draw to calculate our derived parameter(s) of interest. After 2,000 iterations, we therefore have 2,000 independent draws from the sampling distribution of each transition rate and derived parameter.</w:t>
       </w:r>
     </w:p>
     <w:p>
@@ -2372,7 +2414,7 @@
         <w:t xml:space="preserve">1</w:t>
       </w:r>
       <w:r>
-        <w:t xml:space="preserve">). For instance, the sample estimate for the vegetative-reproductive growth transition is 0.22 (2/9), but the upper bound of the 95% credible interval suggests this transition rate could plausibly be as high as 0.45 in the population at large. Correspondingly, there is substantial sampling uncertainty in some derived parameters (Fig.</w:t>
+        <w:t xml:space="preserve">). For instance, the sample estimate for the vegetative-reproductive growth transition is 0.22 (2/9), but the upper bound of the 95% bootstrap interval suggests this transition rate could plausibly be as high as 0.45 in the population at large. Correspondingly, there is substantial sampling uncertainty in some derived parameters (Fig.</w:t>
       </w:r>
       <w:r>
         <w:t xml:space="preserve"> </w:t>
@@ -2381,7 +2423,7 @@
         <w:t xml:space="preserve">2</w:t>
       </w:r>
       <w:r>
-        <w:t xml:space="preserve">). Based on the 95% credible interval bounds, the equilibrium population growth rate could be as low as –17% per year or as high as +1% per year; life expectancy could be as low as 3.5 years or as high as 18.2 years; and the reproductive value of the vegetative stage class could be 22% lower than that of the seedling stage or 1460% higher.</w:t>
+        <w:t xml:space="preserve">). Based on the 95% bootstrap interval bounds, the equilibrium population growth rate could be as low as –17% per year or as high as +1% per year; life expectancy could be as low as 3.5 years or as high as 18.2 years; and the reproductive value of the vegetative stage class could be 22% lower than that of the seedling stage or 1460% higher.</w:t>
       </w:r>
     </w:p>
     <w:p>
@@ -2389,17 +2431,17 @@
         <w:pStyle w:val="BodyText"/>
       </w:pPr>
       <w:r>
-        <w:t xml:space="preserve">We chose two case studies to illuminate contrasting contexts in which sampling uncertainty may be relevant. Case Study 1 is a comparative analysis across many species and populations, in which derived traits depend heavily on long-term survivorship inferred indirectly from stage-structured matrices, precisely the setting in which sampling uncertainty might compound. Case Study 2, by contrast, is a within-species time series in which the response variable is a directly observed count, the statistical model is closely tied to the raw data, and the question concerns an environmental driver rather than a demographic trait per se. Together, the two analyses bracket a range of typical uses of published MPMs and allow us to ask whether the consequences of sampling uncertainty are consistent across these contexts or depend on the nature of the analysis.</w:t>
-      </w:r>
-    </w:p>
-    <w:bookmarkEnd w:id="29"/>
-    <w:bookmarkStart w:id="30" w:name="X737385d5ee45ddac807f16f7cffd7ac99bd8839"/>
-    <w:p>
-      <w:pPr>
-        <w:pStyle w:val="Heading2"/>
-      </w:pPr>
-      <w:r>
-        <w:t xml:space="preserve">Case Study #1: Comparative analysis of mortality trajectories</w:t>
+        <w:t xml:space="preserve">We chose two analyses to illuminate contrasting contexts in which sampling uncertainty may be relevant. Analysis 1 is a comparative analysis across many species and populations, in which derived traits depend heavily on long-term survivorship inferred indirectly from stage-structured matrices, precisely the setting in which sampling uncertainty might compound. Analysis 2, by contrast, is a within-species time series in which the response variable is a directly observed count, the statistical model is closely tied to the raw data, and the question concerns an environmental driver rather than a demographic trait per se. Together, the two analyses bracket a range of typical uses of published MPMs and allow us to ask whether the consequences of sampling uncertainty are consistent across these contexts or depend on the nature of the analysis.</w:t>
+      </w:r>
+    </w:p>
+    <w:bookmarkEnd w:id="30"/>
+    <w:bookmarkStart w:id="31" w:name="X349b7ec3116bc91db23218542ca4014d9cbeed5"/>
+    <w:p>
+      <w:pPr>
+        <w:pStyle w:val="Heading3"/>
+      </w:pPr>
+      <w:r>
+        <w:t xml:space="preserve">Analysis 1: Comparative analysis of mortality trajectories</w:t>
       </w:r>
     </w:p>
     <w:p>
@@ -2443,7 +2485,7 @@
         </m:r>
       </m:oMath>
       <w:r>
-        <w:t xml:space="preserve">), we first used age-from-stage methods (Cochran and Ellner 1992, Caswell 2001 Sec. 5.3) to derive a survivorship trajectory from each MPM, starting from the first stage class(es) with positive reproduction (see the Supplementary Materials for further details). We then estimated mature life expectancy by summing over the survivorship trajectory, as in</w:t>
+        <w:t xml:space="preserve">), we first used age-from-stage methods (Cochran and Ellner 1992, Caswell 2001 Sec. 5.3) to derive a survivorship trajectory from each MPM, starting from the first stage class(es) with positive reproduction (see Supplementary Methods section S1.2 for details). We then estimated mature life expectancy by summing over the survivorship trajectory, as in Eq. (3),</w:t>
       </w:r>
     </w:p>
     <w:p>
@@ -2502,6 +2544,22 @@
             </m:rPr>
             <m:t>,</m:t>
           </m:r>
+          <m:r>
+            <m:t>  </m:t>
+          </m:r>
+          <m:d>
+            <m:dPr>
+              <m:begChr m:val="("/>
+              <m:sepChr m:val=""/>
+              <m:endChr m:val=")"/>
+              <m:grow/>
+            </m:dPr>
+            <m:e>
+              <m:r>
+                <m:t>3</m:t>
+              </m:r>
+            </m:e>
+          </m:d>
         </m:oMath>
       </m:oMathPara>
     </w:p>
@@ -2544,7 +2602,7 @@
         </m:r>
       </m:oMath>
       <w:r>
-        <w:t xml:space="preserve">. To estimate shape, we used a metric proposed by Baudisch and Stott (2019), which compares the area under a survivorship trajectory to that under a reference trajectory assuming constant mortality with age. The metric can take any continuous value between –0.5 (maximal negative senescence; all individuals die at the age of maturity) and +0.5 (maximal senescence; all individuals die at the age of maximum longevity), with a value of 0 indicating a constant mortality rate (negligible senescence). Values of shape greater than, equal to, or less than zero correspond to Type I, II, and III survivorship curves, respectively. When deriving a survivorship trajectory from an MPM, the apparent mortality rate is guaranteed to approach a plateau as the stage distribution approaches its equilibrium (Horvitz and Tuljapurkar 2008). To avoid bias from artefactual mortality plateaus, we calculated shape from truncated survivorship trajectories, limited to the period before a cohort reaches its quasi-stable distribution (based on a distance threshold of 1%; see the Supplementary Materials for further details).</w:t>
+        <w:t xml:space="preserve">. To estimate shape, we used a metric proposed by Baudisch and Stott (2019), which compares the area under a survivorship trajectory to that under a reference trajectory assuming constant mortality with age. The metric can take any continuous value between –0.5 (maximal negative senescence; all individuals die at the age of maturity) and +0.5 (maximal senescence; all individuals die at the age of maximum longevity), with a value of 0 indicating a constant mortality rate (negligible senescence). Values of shape greater than, equal to, or less than zero correspond to Type I, II, and III survivorship curves, respectively. When deriving a survivorship trajectory from an MPM, the apparent mortality rate is guaranteed to approach a plateau as the stage distribution approaches its equilibrium (Horvitz and Tuljapurkar 2008). To avoid bias from artefactual mortality plateaus, we calculated shape from truncated survivorship trajectories, limited to the period before a cohort reaches its quasi-stable distribution (based on a distance threshold of 1%; see Supplementary Methods section S1.2).</w:t>
       </w:r>
     </w:p>
     <w:p>
@@ -2552,7 +2610,7 @@
         <w:pStyle w:val="BodyText"/>
       </w:pPr>
       <w:r>
-        <w:t xml:space="preserve">We calculated life expectancy and shape at the population level, as defined in COMPADRE. For populations with temporal replication (i.e., MPMs across multiple time periods), we used the pooled population MPM in our analysis, if available; otherwise, we used the population mean MPM. To model sampling uncertainty for pooled or mean MPMs, we pooled stage-specific sample sizes across years (see further details in the Supplementary Materials). This approach ignores uncertainty arising from temporal variation in transition rates and therefore underestimates overall uncertainty in the pooled estimates. The degree of underestimation depends on how much transition rates vary across years relative to within-year sampling error; for species with high interannual variability, the bias could be substantial. Results should therefore be interpreted conservatively with respect to the influence of sampling uncertainty.</w:t>
+        <w:t xml:space="preserve">We calculated life expectancy and shape at the population level, as defined in COMPADRE. For populations with temporal replication (i.e., MPMs across multiple time periods), we used the pooled population MPM in our analysis, if available; otherwise, we used the population mean MPM. To model sampling uncertainty for pooled or mean MPMs, we pooled stage-specific sample sizes across years (see Supplementary Methods section S1.3). This approach ignores uncertainty arising from temporal variation in transition rates and therefore underestimates overall uncertainty in the pooled estimates. The degree of underestimation depends on how much transition rates vary across years relative to within-year sampling error; for species with high interannual variability, the bias could be substantial. Results should therefore be interpreted conservatively with respect to the influence of sampling uncertainty.</w:t>
       </w:r>
     </w:p>
     <w:p>
@@ -2560,7 +2618,7 @@
         <w:pStyle w:val="BodyText"/>
       </w:pPr>
       <w:r>
-        <w:t xml:space="preserve">To model the relationship between point estimates of mature life expectancy and shape, we used a linear model with random intercepts at the species level (to account for non-independence among populations of the same species), as in</w:t>
+        <w:t xml:space="preserve">To model the relationship between point estimates of mature life expectancy and shape, we used a linear model with random intercepts at the species level (to account for non-independence among populations of the same species), as in Eq. (4),</w:t>
       </w:r>
     </w:p>
     <w:p>
@@ -2670,6 +2728,22 @@
             </m:rPr>
             <m:t>,</m:t>
           </m:r>
+          <m:r>
+            <m:t>  </m:t>
+          </m:r>
+          <m:d>
+            <m:dPr>
+              <m:begChr m:val="("/>
+              <m:sepChr m:val=""/>
+              <m:endChr m:val=")"/>
+              <m:grow/>
+            </m:dPr>
+            <m:e>
+              <m:r>
+                <m:t>4</m:t>
+              </m:r>
+            </m:e>
+          </m:d>
         </m:oMath>
       </m:oMathPara>
     </w:p>
@@ -3026,7 +3100,7 @@
         </m:sSubSup>
       </m:oMath>
       <w:r>
-        <w:t xml:space="preserve">) of their respective sampling distributions (derived as described in the sampling-distribution section above), as in</w:t>
+        <w:t xml:space="preserve">) of their respective sampling distributions (derived as described in the sampling-distribution section above), as in Eqs. (5), (6), and (7),</w:t>
       </w:r>
     </w:p>
     <w:p>
@@ -3136,6 +3210,22 @@
             </m:rPr>
             <m:t>,</m:t>
           </m:r>
+          <m:r>
+            <m:t>  </m:t>
+          </m:r>
+          <m:d>
+            <m:dPr>
+              <m:begChr m:val="("/>
+              <m:sepChr m:val=""/>
+              <m:endChr m:val=")"/>
+              <m:grow/>
+            </m:dPr>
+            <m:e>
+              <m:r>
+                <m:t>5</m:t>
+              </m:r>
+            </m:e>
+          </m:d>
         </m:oMath>
       </m:oMathPara>
     </w:p>
@@ -3249,6 +3339,22 @@
             </m:rPr>
             <m:t>,</m:t>
           </m:r>
+          <m:r>
+            <m:t>  </m:t>
+          </m:r>
+          <m:d>
+            <m:dPr>
+              <m:begChr m:val="("/>
+              <m:sepChr m:val=""/>
+              <m:endChr m:val=")"/>
+              <m:grow/>
+            </m:dPr>
+            <m:e>
+              <m:r>
+                <m:t>6</m:t>
+              </m:r>
+            </m:e>
+          </m:d>
         </m:oMath>
       </m:oMathPara>
     </w:p>
@@ -3362,6 +3468,22 @@
             </m:rPr>
             <m:t>.</m:t>
           </m:r>
+          <m:r>
+            <m:t>  </m:t>
+          </m:r>
+          <m:d>
+            <m:dPr>
+              <m:begChr m:val="("/>
+              <m:sepChr m:val=""/>
+              <m:endChr m:val=")"/>
+              <m:grow/>
+            </m:dPr>
+            <m:e>
+              <m:r>
+                <m:t>7</m:t>
+              </m:r>
+            </m:e>
+          </m:d>
         </m:oMath>
       </m:oMathPara>
     </w:p>
@@ -3370,7 +3492,7 @@
         <w:pStyle w:val="FirstParagraph"/>
       </w:pPr>
       <w:r>
-        <w:t xml:space="preserve">We fit the models described above using RStan (Stan Development Team 2025; Carpenter et al. 2017), with priors and settings as described in the Supplementary Materials.</w:t>
+        <w:t xml:space="preserve">We fit the models described above using RStan (Stan Development Team 2025; Carpenter et al. 2017), with priors and settings as described in Supplementary Methods section S1.4.</w:t>
       </w:r>
     </w:p>
     <w:p>
@@ -3378,17 +3500,17 @@
         <w:pStyle w:val="BodyText"/>
       </w:pPr>
       <w:r>
-        <w:t xml:space="preserve">In supplementary analyses, we estimated the variance components of life expectancy, shape, and other life history traits using a sampling-to-other variance ratio: the proportion of total observed variation in a demographic parameter attributable to transition-rate sampling uncertainty relative to variation from all other sources (principally biological variation among populations and species). For each parameter we partitioned total variance into a sampling component, estimated as the mean of the within-MPM sampling variances derived from the bootstrap distributions, and a residual component representing the remainder. A ratio greater than 1 indicates that sampling uncertainty exceeds biological variation; a ratio less than 1 indicates that biological variation dominates. Full details are given in the Supplementary Materials.</w:t>
-      </w:r>
-    </w:p>
-    <w:bookmarkEnd w:id="30"/>
-    <w:bookmarkStart w:id="31" w:name="X225d76c27ee8e416a0695c8b196288d200854a5"/>
-    <w:p>
-      <w:pPr>
-        <w:pStyle w:val="Heading2"/>
-      </w:pPr>
-      <w:r>
-        <w:t xml:space="preserve">Case Study #2: The impact of weather on demographic traits</w:t>
+        <w:t xml:space="preserve">In supplementary analyses, we estimated the variance components of life expectancy, shape, and other life history traits using a sampling-to-other variance ratio: the proportion of total observed variation in a demographic parameter attributable to transition-rate sampling uncertainty relative to variation from all other sources (principally biological variation among populations and species). For each parameter we partitioned total variance into a sampling component, estimated as the mean of the within-MPM sampling variances derived from the bootstrap distributions, and a residual component representing the remainder. A ratio greater than 1 indicates that sampling uncertainty exceeds biological variation; a ratio less than 1 indicates that biological variation dominates. Full details are given in Supplementary Methods section S1.5 and Supplementary Table S3.</w:t>
+      </w:r>
+    </w:p>
+    <w:bookmarkEnd w:id="31"/>
+    <w:bookmarkStart w:id="32" w:name="Xa6846656006b1b9058ef913d8de9a898b7446a1"/>
+    <w:p>
+      <w:pPr>
+        <w:pStyle w:val="Heading3"/>
+      </w:pPr>
+      <w:r>
+        <w:t xml:space="preserve">Analysis 2: The impact of weather on demographic traits</w:t>
       </w:r>
     </w:p>
     <w:p>
@@ -3412,7 +3534,7 @@
         <w:t xml:space="preserve"> </w:t>
       </w:r>
       <w:r>
-        <w:t xml:space="preserve">(Lesica and Crone 2007), a perennial herb found in semi-arid grasslands of western North America. In that study, transition rates were estimated using the methods described above (i.e. , as ratios of two integers), and the corresponding stage-specific sample sizes are reported in Ellis et al. (2012). Eight of the MPMs in the 12-year time-series were non-ergodic due to missing estimates for the</w:t>
+        <w:t xml:space="preserve">(Lesica and Crone 2007), a perennial herb found in semi-arid grasslands of western North America. In that study, transition rates were estimated using the methods described above, as ratios of two integers (Eqs. (1) and (2)), and the corresponding stage-specific sample sizes are reported in Ellis et al. (2012). Eight of the MPMs in the 12-year time-series were non-ergodic due to missing estimates for the</w:t>
       </w:r>
       <w:r>
         <w:t xml:space="preserve"> </w:t>
@@ -3467,7 +3589,7 @@
         </m:r>
       </m:oMath>
       <w:r>
-        <w:t xml:space="preserve">). We note that recruitment estimated in this way is a relatively aggregated transition whose behaviour under sampling uncertainty may differ from that of survival transitions, and that results from this case study should not be assumed to generalise to other transition types.</w:t>
+        <w:t xml:space="preserve">). We note that recruitment estimated in this way is a relatively aggregated transition whose behaviour under sampling uncertainty may differ from that of survival transitions, and that results from this analysis should not be assumed to generalise to other transition types.</w:t>
       </w:r>
     </w:p>
     <w:p>
@@ -3475,7 +3597,7 @@
         <w:pStyle w:val="BodyText"/>
       </w:pPr>
       <w:r>
-        <w:t xml:space="preserve">We examined the effect of monthly temperature deviations on annual recruitment using a similar approach to Teller et al. (2016), in which we model separate slope coefficients for a series of</w:t>
+        <w:t xml:space="preserve">We examined the effect of monthly temperature deviations, derived from PRISM monthly temperature rasters extracted at the study population coordinates (Supplementary Methods section S1.6), on annual recruitment using a similar approach to Teller et al. (2016), in which we model separate slope coefficients for a series of</w:t>
       </w:r>
       <w:r>
         <w:t xml:space="preserve"> </w:t>
@@ -3489,7 +3611,7 @@
         <w:t xml:space="preserve"> </w:t>
       </w:r>
       <w:r>
-        <w:t xml:space="preserve">monthly lags (i.e., going back in time from the end of a given transition interval) in a way that allows smoothing of coefficients across nearby lags. The smoothing model we use here is a Gaussian process with an exponential covariance function, as in</w:t>
+        <w:t xml:space="preserve">monthly lags (i.e., going back in time from the end of a given transition interval) in a way that allows smoothing of coefficients across nearby lags. The smoothing model we use here is a Gaussian process with an exponential covariance function, as in Eq. (8),</w:t>
       </w:r>
     </w:p>
     <w:p>
@@ -3629,6 +3751,22 @@
               </m:sSup>
             </m:e>
           </m:d>
+          <m:r>
+            <m:t>  </m:t>
+          </m:r>
+          <m:d>
+            <m:dPr>
+              <m:begChr m:val="("/>
+              <m:sepChr m:val=""/>
+              <m:endChr m:val=")"/>
+              <m:grow/>
+            </m:dPr>
+            <m:e>
+              <m:r>
+                <m:t>8</m:t>
+              </m:r>
+            </m:e>
+          </m:d>
         </m:oMath>
       </m:oMathPara>
     </w:p>
@@ -3693,6 +3831,22 @@
               </m:r>
               <m:r>
                 <m:t>Σ</m:t>
+              </m:r>
+            </m:e>
+          </m:d>
+          <m:r>
+            <m:t>  </m:t>
+          </m:r>
+          <m:d>
+            <m:dPr>
+              <m:begChr m:val="("/>
+              <m:sepChr m:val=""/>
+              <m:endChr m:val=")"/>
+              <m:grow/>
+            </m:dPr>
+            <m:e>
+              <m:r>
+                <m:t>9</m:t>
               </m:r>
             </m:e>
           </m:d>
@@ -3829,6 +3983,22 @@
               </m:sSup>
             </m:e>
           </m:d>
+          <m:r>
+            <m:t>  </m:t>
+          </m:r>
+          <m:d>
+            <m:dPr>
+              <m:begChr m:val="("/>
+              <m:sepChr m:val=""/>
+              <m:endChr m:val=")"/>
+              <m:grow/>
+            </m:dPr>
+            <m:e>
+              <m:r>
+                <m:t>10</m:t>
+              </m:r>
+            </m:e>
+          </m:d>
         </m:oMath>
       </m:oMathPara>
     </w:p>
@@ -4115,7 +4285,7 @@
         </m:r>
       </m:oMath>
       <w:r>
-        <w:t xml:space="preserve">. To incorporate sampling uncertainty into our model, we model the raw counts underlying the recruitment point estimates using a Poisson distribution, as in</w:t>
+        <w:t xml:space="preserve">. To incorporate sampling uncertainty into our model, we model the raw counts underlying the recruitment point estimates using a Poisson distribution, as in Eq. (11),</w:t>
       </w:r>
     </w:p>
     <w:p>
@@ -4249,6 +4419,22 @@
               </m:d>
             </m:e>
           </m:d>
+          <m:r>
+            <m:t>  </m:t>
+          </m:r>
+          <m:d>
+            <m:dPr>
+              <m:begChr m:val="("/>
+              <m:sepChr m:val=""/>
+              <m:endChr m:val=")"/>
+              <m:grow/>
+            </m:dPr>
+            <m:e>
+              <m:r>
+                <m:t>11</m:t>
+              </m:r>
+            </m:e>
+          </m:d>
         </m:oMath>
       </m:oMathPara>
     </w:p>
@@ -4383,6 +4569,22 @@
                   </m:r>
                 </m:sup>
               </m:sSubSup>
+            </m:e>
+          </m:d>
+          <m:r>
+            <m:t>  </m:t>
+          </m:r>
+          <m:d>
+            <m:dPr>
+              <m:begChr m:val="("/>
+              <m:sepChr m:val=""/>
+              <m:endChr m:val=")"/>
+              <m:grow/>
+            </m:dPr>
+            <m:e>
+              <m:r>
+                <m:t>12</m:t>
+              </m:r>
             </m:e>
           </m:d>
         </m:oMath>
@@ -4730,12 +4932,13 @@
         </m:sSub>
       </m:oMath>
       <w:r>
-        <w:t xml:space="preserve">), rather than a single model intercept as before. We fit the above-described models again using RStan, with priors and settings as described in the Supplementary Materials.</w:t>
-      </w:r>
-    </w:p>
-    <w:bookmarkEnd w:id="31"/>
+        <w:t xml:space="preserve">), rather than a single model intercept as before. We fit the above-described models again using RStan, with priors and settings as described in Supplementary Methods section S1.4.</w:t>
+      </w:r>
+    </w:p>
     <w:bookmarkEnd w:id="32"/>
-    <w:bookmarkStart w:id="35" w:name="results"/>
+    <w:bookmarkEnd w:id="33"/>
+    <w:bookmarkEnd w:id="34"/>
+    <w:bookmarkStart w:id="37" w:name="results"/>
     <w:p>
       <w:pPr>
         <w:pStyle w:val="Heading1"/>
@@ -4744,13 +4947,13 @@
         <w:t xml:space="preserve">Results</w:t>
       </w:r>
     </w:p>
-    <w:bookmarkStart w:id="33" w:name="X45780009aee89a82be8802d6a315b66af571112"/>
+    <w:bookmarkStart w:id="35" w:name="Xdd6638ed7316a87858b3445bbb79e25a6ceb092"/>
     <w:p>
       <w:pPr>
         <w:pStyle w:val="Heading2"/>
       </w:pPr>
       <w:r>
-        <w:t xml:space="preserve">Case study #1: Comparative analysis of mortality trajectories</w:t>
+        <w:t xml:space="preserve">Analysis 1: Comparative analysis of mortality trajectories</w:t>
       </w:r>
     </w:p>
     <w:p>
@@ -4758,7 +4961,7 @@
         <w:pStyle w:val="FirstParagraph"/>
       </w:pPr>
       <w:r>
-        <w:t xml:space="preserve">For our parameters of interest, life expectancy and shape, the estimated sampling-to-other variance ratios were 2.00 and 3.29, respectively (Table</w:t>
+        <w:t xml:space="preserve">For our parameters of interest, life expectancy and shape, the estimated sampling-to-other variance ratios across population-level MPM entries in analysis 1 were 2.00 and 3.28, respectively (Table</w:t>
       </w:r>
       <w:r>
         <w:t xml:space="preserve"> </w:t>
@@ -4776,7 +4979,7 @@
         <w:t xml:space="preserve">3</w:t>
       </w:r>
       <w:r>
-        <w:t xml:space="preserve">). For shape, the most extreme positive and negative point estimates tended to have sampling distributions shifted much closer to zero, whereas for mature life expectancy, many point estimates were skewed upward from the median of the sampling distribution. The mismatches between point estimates and sampling distributions usually coincided with a boundary estimate of stage-specific survival (i.e. a point estimate approaching either 0% or 100%). Supplementary analyses suggest that these boundary estimates can skew a point estimate of life expectancy or shape away from the majority of its sampling distribution (see the Supplementary Materials).</w:t>
+        <w:t xml:space="preserve">). For shape, the most extreme positive and negative point estimates tended to have sampling distributions shifted much closer to zero, whereas for mature life expectancy, many point estimates were skewed upward from the median of the sampling distribution. The mismatches between point estimates and sampling distributions usually coincided with a boundary estimate of stage-specific survival (i.e. a point estimate approaching either 0% or 100%). Supplementary analyses suggest that these boundary estimates can skew a point estimate of life expectancy or shape away from the majority of its sampling distribution (see Supplementary Figure S1 and Supplementary Figure S2).</w:t>
       </w:r>
     </w:p>
     <w:p>
@@ -4793,7 +4996,7 @@
         <w:t xml:space="preserve">4</w:t>
       </w:r>
       <w:r>
-        <w:t xml:space="preserve">). For the slope parameter β, the posterior distribution from the point estimate model was centred slightly to the left of zero (P[β &gt; 0] = 0.250), whereas the corresponding posterior from the sampling uncertainty model was shifted somewhat to the right (P[β &gt; 0] = 0.685), indicating stronger evidence for a positive relationship between life expectancy and shape.</w:t>
+        <w:t xml:space="preserve">). For the slope parameter β, the posterior distribution from the point estimate model was centred slightly to the left of zero (P[β &gt; 0] = 0.258), whereas the corresponding posterior from the sampling uncertainty model was shifted somewhat to the right (P[β &gt; 0] = 0.646), indicating stronger evidence for a positive relationship between life expectancy and shape.</w:t>
       </w:r>
     </w:p>
     <w:p>
@@ -4813,14 +5016,14 @@
         <w:t xml:space="preserve">A shows, tend to cluster much closer to zero, the data are effectively less dispersed, and the slope becomes easier to pin down.</w:t>
       </w:r>
     </w:p>
-    <w:bookmarkEnd w:id="33"/>
-    <w:bookmarkStart w:id="34" w:name="X4a02ae50c8f0b3438ed9d0c93d1ff58c2ebcf12"/>
+    <w:bookmarkEnd w:id="35"/>
+    <w:bookmarkStart w:id="36" w:name="Xa844334e68bdd149df766f2d8c8c13e59d9ac1f"/>
     <w:p>
       <w:pPr>
         <w:pStyle w:val="Heading2"/>
       </w:pPr>
       <w:r>
-        <w:t xml:space="preserve">Case Study #2: The impact of weather on demographic traits</w:t>
+        <w:t xml:space="preserve">Analysis 2: The impact of weather on demographic traits</w:t>
       </w:r>
     </w:p>
     <w:p>
@@ -4837,7 +5040,7 @@
         <w:t xml:space="preserve">5</w:t>
       </w:r>
       <w:r>
-        <w:t xml:space="preserve">). Both identified temperature deviations in monthly lags 7-9 (February-April, prior to the start of the transition interval in July) as having a positive effect on recruitment. If we simplify our model and consider only the relationship between recruitment and mean spring temperature deviations (see the full model specification in the Supplementary Materials), we again find that the point estimate model is similar to the model incorporating sampling uncertainty (Fig.</w:t>
+        <w:t xml:space="preserve">). Both models identified temperature deviations in monthly lags 7-9 (February-April, prior to the start of the transition interval in July) as having a positive effect on recruitment. If we simplify our model and consider only the relationship between recruitment and mean spring temperature deviations (see Supplementary Methods section S1.6 and Supplementary Table S5), we again find that the point estimate model is similar to the model incorporating sampling uncertainty (Fig.</w:t>
       </w:r>
       <w:r>
         <w:t xml:space="preserve"> </w:t>
@@ -4860,12 +5063,12 @@
         <w:t xml:space="preserve"> </w:t>
       </w:r>
       <w:r>
-        <w:t xml:space="preserve">was 6.1% higher, and the 95% interval width for that estimatewas 10.5% higher, in the model incorporating sampling uncertainty compared with the point estimate model. A difference of this magnitude is unlikely to qualitatively change any inferences drawn from a model.</w:t>
-      </w:r>
-    </w:p>
-    <w:bookmarkEnd w:id="34"/>
-    <w:bookmarkEnd w:id="35"/>
-    <w:bookmarkStart w:id="42" w:name="discussion"/>
+        <w:t xml:space="preserve">was 8.0% higher, and the 95% interval width for that estimate was 10.9% higher, in the model incorporating sampling uncertainty compared with the point estimate model. A difference of this magnitude is unlikely to qualitatively change any inferences drawn from a model.</w:t>
+      </w:r>
+    </w:p>
+    <w:bookmarkEnd w:id="36"/>
+    <w:bookmarkEnd w:id="37"/>
+    <w:bookmarkStart w:id="44" w:name="discussion"/>
     <w:p>
       <w:pPr>
         <w:pStyle w:val="Heading1"/>
@@ -4874,7 +5077,7 @@
         <w:t xml:space="preserve">Discussion</w:t>
       </w:r>
     </w:p>
-    <w:bookmarkStart w:id="36" w:name="Xc4e9ecdc28d90ee6ac1ec849a27dcbf36aba354"/>
+    <w:bookmarkStart w:id="38" w:name="Xc4e9ecdc28d90ee6ac1ec849a27dcbf36aba354"/>
     <w:p>
       <w:pPr>
         <w:pStyle w:val="Heading2"/>
@@ -4908,11 +5111,11 @@
         <w:pStyle w:val="BodyText"/>
       </w:pPr>
       <w:r>
-        <w:t xml:space="preserve">For several commonly used integrated demographic metrics, such as population growth rate (λ), generation time, and individual growth rate, sampling uncertainty accounted for only a small fraction of the total variation observed among populations. By contrast, traits related to mortality trajectories, particularly the shape of the mortality distribution, were far more sensitive: nearly half of the total variation in shape was attributable to sampling uncertainty. In these cases, much of the apparent variation among published MPMs is not distinguishable from statistical noise. This result helps explain why incorporating sampling uncertainty shifted inference in the senescence analysis but had little effect in the climate-recruitment case study, where the response variable was more directly linked to observed counts and less dependent on long-term survivorship.</w:t>
-      </w:r>
-    </w:p>
-    <w:bookmarkEnd w:id="36"/>
-    <w:bookmarkStart w:id="37" w:name="Xcc44e14f294f4d2981b95417a1e5cf8a03da4dc"/>
+        <w:t xml:space="preserve">For several commonly used integrated demographic metrics, such as population growth rate (λ), generation time, and individual growth rate, sampling uncertainty accounted for only a small fraction of the total variation observed among populations. By contrast, traits related to mortality trajectories, particularly the shape of the mortality distribution, were far more sensitive: nearly half of the total variation in shape was attributable to sampling uncertainty. In these cases, much of the apparent variation among published MPMs is not distinguishable from statistical noise. This result helps explain why incorporating sampling uncertainty shifted inference in the senescence analysis but had little effect in the climate-recruitment analysis, where the response variable was more directly linked to observed counts and less dependent on long-term survivorship.</w:t>
+      </w:r>
+    </w:p>
+    <w:bookmarkEnd w:id="38"/>
+    <w:bookmarkStart w:id="39" w:name="Xcc44e14f294f4d2981b95417a1e5cf8a03da4dc"/>
     <w:p>
       <w:pPr>
         <w:pStyle w:val="Heading2"/>
@@ -4934,11 +5137,11 @@
         <w:pStyle w:val="BodyText"/>
       </w:pPr>
       <w:r>
-        <w:t xml:space="preserve">Several features of MPM structure exacerbate this sensitivity. Among the species-averaged MPMs in COMPADRE, 35% include only a single reproductive stage class, providing no information on age-related variation among individuals that enter and remain in the reproductive class until death. Even among matrices with two or more reproductive stages, 28% have a time to quasi-stable distribution shorter than one life expectancy, limiting reliable mortality estimates to relatively young age classes. A particularly important source of distortion arises from boundary estimates of stage-specific survival, where point estimates approach either 0% or 100%. Such estimates are common in published matrices, often arising from small sample sizes or limited temporal replication, and can systematically displace point estimates of derived traits from the centre of their sampling distributions. These effects are not well captured by empirical bootstrapping, which cannot generate variation when all individuals experience the same outcome. Notably, survival estimates of 100% occur in 24% of species-averaged MPMs in COMPADRE (though only 7% in COMADRE), indicating that this is not a rare edge case.</w:t>
-      </w:r>
-    </w:p>
-    <w:bookmarkEnd w:id="37"/>
-    <w:bookmarkStart w:id="38" w:name="X0adf71d4d7a20b69e30fb81dd3c4bc398b81df0"/>
+        <w:t xml:space="preserve">Several features of MPM structure exacerbate this sensitivity. In the species-level mean MPM set used for analysis 1 (26 species; species identities listed in Supplementary Methods section S1.8), 35% include only a single reproductive stage class, providing no information on age-related variation among individuals that enter and remain in the reproductive class until death. Even among matrices with two or more reproductive stages, 28% reach a quasi-stable distribution in less than one life expectancy, limiting reliable mortality estimates to relatively young age classes. A particularly important source of distortion arises from boundary estimates of stage-specific survival, where point estimates approach either 0% or 100%. Such estimates are common in published matrices, often arising from small sample sizes or limited temporal replication, and can systematically displace point estimates of derived traits from the centre of their sampling distributions. These effects are not well captured by empirical bootstrapping, which cannot generate variation when all individuals experience the same outcome. Notably, survival estimates of 100% occur in 24% of species-averaged MPMs in COMPADRE (though only 7% in COMADRE), indicating that this is not a rare edge case.</w:t>
+      </w:r>
+    </w:p>
+    <w:bookmarkEnd w:id="39"/>
+    <w:bookmarkStart w:id="40" w:name="X0adf71d4d7a20b69e30fb81dd3c4bc398b81df0"/>
     <w:p>
       <w:pPr>
         <w:pStyle w:val="Heading2"/>
@@ -5016,11 +5219,19 @@
         <w:pStyle w:val="FirstParagraph"/>
       </w:pPr>
       <w:r>
-        <w:t xml:space="preserve">When one or more of these features are present, point estimates derived from MPMs may be biased or overconfident, even when they appear precise. Importantly, the absence of a detectable effect of sampling uncertainty in some analyses, such as our climate–recruitment case study, should not be taken as evidence that uncertainty propagation is unnecessary. Rather, it underscores the need for a trait- and context-specific assessment of robustness.</w:t>
-      </w:r>
-    </w:p>
-    <w:bookmarkEnd w:id="38"/>
-    <w:bookmarkStart w:id="39" w:name="X5fdc7baf4020c1b023796c87a5028343841c135"/>
+        <w:t xml:space="preserve">Here, key transitions are matrix elements with strong influence on the focal derived quantity.</w:t>
+      </w:r>
+    </w:p>
+    <w:p>
+      <w:pPr>
+        <w:pStyle w:val="BodyText"/>
+      </w:pPr>
+      <w:r>
+        <w:t xml:space="preserve">When one or more of these features are present, point estimates derived from MPMs may be biased or overconfident, even if they appear precise. Importantly, the absence of a detectable effect of sampling uncertainty in some analyses, such as our climate-recruitment analysis, should not be taken as evidence that uncertainty propagation is unnecessary. Rather, it underscores the need for a trait- and context-specific assessment of robustness.</w:t>
+      </w:r>
+    </w:p>
+    <w:bookmarkEnd w:id="40"/>
+    <w:bookmarkStart w:id="41" w:name="X5fdc7baf4020c1b023796c87a5028343841c135"/>
     <w:p>
       <w:pPr>
         <w:pStyle w:val="Heading2"/>
@@ -5037,8 +5248,8 @@
         <w:t xml:space="preserve">It is important to emphasise that our analysis of sampling uncertainty is distinct from demographic stochasticity, a distinction that is sometimes blurred in the literature (Kendall 1998). In the current study, we assume that the parameter of interest is the population mean of a demographic trait and focus exclusively on uncertainty arising from finite sampling of that mean. In addition, individuals within a population are likely to exhibit genuine variation around the population mean in demographic rates, giving rise to demographic stochasticity. Both sources of uncertainty can have important implications for applications such as population viability analyses, where failing to account for either demographic stochasticity or sampling uncertainty can lead to biased estimates of extinction risk (Kendall and Fox 2002, McGowan et al. 2011). Distinguishing between these sources of uncertainty is therefore essential for appropriate interpretation.</w:t>
       </w:r>
     </w:p>
-    <w:bookmarkEnd w:id="39"/>
-    <w:bookmarkStart w:id="40" w:name="X3d7c66beb63a3fc1b0330934550b7cb901681b0"/>
+    <w:bookmarkEnd w:id="41"/>
+    <w:bookmarkStart w:id="42" w:name="X3d7c66beb63a3fc1b0330934550b7cb901681b0"/>
     <w:p>
       <w:pPr>
         <w:pStyle w:val="Heading2"/>
@@ -5052,7 +5263,7 @@
         <w:pStyle w:val="FirstParagraph"/>
       </w:pPr>
       <w:r>
-        <w:t xml:space="preserve">Incorporating transition-rate sampling uncertainty into analyses of published MPMs remains challenging, primarily because the data needed to reconstruct sampling distributions are rarely reported. Of the 91 source publications we initially targeted, only a small subset provided sufficient information to model uncertainty in survival or reproductive transitions. Improved reporting of transition-specific sample sizes or standard errors, particularly on the scale of the linear predictor, would greatly enhance future researchers’ ability to assess robustness and propagate uncertainty where necessary (see the Supplementary Materials for detailed recommendations). At the same time, the absence of a single, universally</w:t>
+        <w:t xml:space="preserve">Incorporating transition-rate sampling uncertainty into analyses of published MPMs remains challenging, primarily because the data required to reconstruct sampling distributions are rarely reported. Of the 91 source publications we initially targeted, only a small subset provided sufficient information to model uncertainty in survival or reproductive transitions. Improved reporting of transition-specific sample sizes or standard errors, particularly on the scale of the linear predictor, would greatly enhance future researchers’ ability to assess robustness and propagate uncertainty where necessary (see Supplementary Methods section S1.7 for detailed recommendations). At the same time, the absence of a single, universally</w:t>
       </w:r>
       <w:r>
         <w:t xml:space="preserve"> </w:t>
@@ -5067,8 +5278,8 @@
         <w:t xml:space="preserve">approach to modelling transition rates should not deter progress. Even partial information can be sufficient to identify cases where inference is likely to be robust or fragile, and recognising the limits of inference is often as important as refining point estimates. Viewed in this light, accounting for sampling uncertainty is not simply a technical exercise but a means of understanding when demographic inference from compiled databases can be trusted and when it should be treated with caution.</w:t>
       </w:r>
     </w:p>
-    <w:bookmarkEnd w:id="40"/>
-    <w:bookmarkStart w:id="41" w:name="conclusions"/>
+    <w:bookmarkEnd w:id="42"/>
+    <w:bookmarkStart w:id="43" w:name="conclusions"/>
     <w:p>
       <w:pPr>
         <w:pStyle w:val="Heading2"/>
@@ -5082,7 +5293,7 @@
         <w:pStyle w:val="FirstParagraph"/>
       </w:pPr>
       <w:r>
-        <w:t xml:space="preserve">Our analyses show that the consequences of transition-rate sampling uncertainty in published matrix population models are highly trait-dependent. For many commonly used integrated demographic metrics, such as population growth rate and generation time, sampling uncertainty accounted for only a small fraction of total variation, suggesting that inference from published MPMs is often robust for these traits. By contrast, parameters related to mortality trajectories, including life expectancy and, especially, the shape of the mortality distribution, were substantially more sensitive to sampling uncertainty. In these cases, a large proportion of apparent variation among published matrices is not distinguishable from statistical noise, and point estimates can be systematically biased by boundary estimates of stage-specific survival.</w:t>
+        <w:t xml:space="preserve">Our analyses show that the consequences of transition-rate sampling uncertainty in published matrix population models are highly trait-dependent. For many commonly used integrated demographic metrics, such as population growth rate and generation time, sampling uncertainty accounted for only a small fraction of total variation, suggesting that inference from published MPMs is often robust for these traits. By contrast, parameters related to mortality trajectories, including life expectancy and, especially, the shape of the mortality distribution, were substantially more sensitive to sampling uncertainty. In these cases, a large proportion of apparent variation among published matrices is indistinguishable from statistical noise, and point estimates can be systematically biased by boundary estimates of stage-specific survival.</w:t>
       </w:r>
     </w:p>
     <w:p>
@@ -5101,9 +5312,9 @@
         <w:t xml:space="preserve">More broadly, the growing availability of large, compiled demographic databases presents both new opportunities and new challenges. The data underlying these databases were collected for diverse purposes, using heterogeneous sampling designs and statistical approaches, resulting in variation not only in sampling uncertainty but also in underlying assumptions and context. Recognising and accounting for these limitations through improved reporting in primary studies and careful, trait-specific interpretation in secondary analyses will be essential to ensure that comparative demography based on published projection matrices yields reliable and biologically meaningful inferences.</w:t>
       </w:r>
     </w:p>
-    <w:bookmarkEnd w:id="41"/>
-    <w:bookmarkEnd w:id="42"/>
-    <w:bookmarkStart w:id="43" w:name="acknowledgements"/>
+    <w:bookmarkEnd w:id="43"/>
+    <w:bookmarkEnd w:id="44"/>
+    <w:bookmarkStart w:id="45" w:name="acknowledgements"/>
     <w:p>
       <w:pPr>
         <w:pStyle w:val="Heading1"/>
@@ -5117,11 +5328,11 @@
         <w:pStyle w:val="FirstParagraph"/>
       </w:pPr>
       <w:r>
-        <w:t xml:space="preserve">We are indebted to the COMPADRE data digitisation team and management committee for their work in developing the COMPADRE Plant Matrix Database. We thank the original study authors who shared additional sample-size information and supporting materials, which enabled inclusion of those matrices in our analyses. This work was supported by a grant from the Independent Research Fund Denmark (grant 6108-00467B).</w:t>
-      </w:r>
-    </w:p>
-    <w:bookmarkEnd w:id="43"/>
-    <w:bookmarkStart w:id="44" w:name="data-availability"/>
+        <w:t xml:space="preserve">We are indebted to the COMPADRE data digitisation team and management committee for their work in developing the COMPADRE Plant Matrix Database. We thank the original study authors who shared additional sample-size information and supporting materials, which enabled the inclusion of those matrices in our analyses. We are especially grateful to Patrick Barks for substantial preparatory work and early analytical contributions to this project. This work was supported by a grant from the Independent Research Fund Denmark (grant 6108-00467B).</w:t>
+      </w:r>
+    </w:p>
+    <w:bookmarkEnd w:id="45"/>
+    <w:bookmarkStart w:id="46" w:name="data-availability"/>
     <w:p>
       <w:pPr>
         <w:pStyle w:val="Heading1"/>
@@ -5138,13 +5349,367 @@
         <w:t xml:space="preserve">Data and code required to reproduce our analyses are archived on Zenodo ([DOI to be added upon deposition]).</w:t>
       </w:r>
     </w:p>
+    <w:bookmarkEnd w:id="46"/>
+    <w:bookmarkStart w:id="47" w:name="supplementary-materials"/>
+    <w:p>
+      <w:pPr>
+        <w:pStyle w:val="Heading1"/>
+      </w:pPr>
+      <w:r>
+        <w:t xml:space="preserve">Supplementary Materials</w:t>
+      </w:r>
+    </w:p>
+    <w:p>
+      <w:pPr>
+        <w:pStyle w:val="FirstParagraph"/>
+      </w:pPr>
+      <w:r>
+        <w:t xml:space="preserve">The supplementary materials include the following items:</w:t>
+      </w:r>
+    </w:p>
+    <w:p>
+      <w:pPr>
+        <w:pStyle w:val="Compact"/>
+        <w:numPr>
+          <w:ilvl w:val="0"/>
+          <w:numId w:val="1003"/>
+        </w:numPr>
+      </w:pPr>
+      <w:r>
+        <w:rPr>
+          <w:b/>
+          <w:bCs/>
+        </w:rPr>
+        <w:t xml:space="preserve">Supplementary Methods S1.1</w:t>
+      </w:r>
+      <w:r>
+        <w:t xml:space="preserve">: Sampling-distribution workflow used for each MPM.</w:t>
+      </w:r>
+    </w:p>
+    <w:p>
+      <w:pPr>
+        <w:pStyle w:val="Compact"/>
+        <w:numPr>
+          <w:ilvl w:val="0"/>
+          <w:numId w:val="1003"/>
+        </w:numPr>
+      </w:pPr>
+      <w:r>
+        <w:rPr>
+          <w:b/>
+          <w:bCs/>
+        </w:rPr>
+        <w:t xml:space="preserve">Supplementary Methods S1.2</w:t>
+      </w:r>
+      <w:r>
+        <w:t xml:space="preserve">: Age-from-stage derivation, truncation, and shape metric.</w:t>
+      </w:r>
+    </w:p>
+    <w:p>
+      <w:pPr>
+        <w:pStyle w:val="Compact"/>
+        <w:numPr>
+          <w:ilvl w:val="0"/>
+          <w:numId w:val="1003"/>
+        </w:numPr>
+      </w:pPr>
+      <w:r>
+        <w:rPr>
+          <w:b/>
+          <w:bCs/>
+        </w:rPr>
+        <w:t xml:space="preserve">Supplementary Methods S1.3</w:t>
+      </w:r>
+      <w:r>
+        <w:t xml:space="preserve">: Pooled and mean MPM handling.</w:t>
+      </w:r>
+    </w:p>
+    <w:p>
+      <w:pPr>
+        <w:pStyle w:val="Compact"/>
+        <w:numPr>
+          <w:ilvl w:val="0"/>
+          <w:numId w:val="1003"/>
+        </w:numPr>
+      </w:pPr>
+      <w:r>
+        <w:rPr>
+          <w:b/>
+          <w:bCs/>
+        </w:rPr>
+        <w:t xml:space="preserve">Supplementary Methods S1.4</w:t>
+      </w:r>
+      <w:r>
+        <w:t xml:space="preserve">: Bayesian model priors and fitting settings.</w:t>
+      </w:r>
+    </w:p>
+    <w:p>
+      <w:pPr>
+        <w:pStyle w:val="Compact"/>
+        <w:numPr>
+          <w:ilvl w:val="0"/>
+          <w:numId w:val="1003"/>
+        </w:numPr>
+      </w:pPr>
+      <w:r>
+        <w:rPr>
+          <w:b/>
+          <w:bCs/>
+        </w:rPr>
+        <w:t xml:space="preserve">Supplementary Methods S1.5</w:t>
+      </w:r>
+      <w:r>
+        <w:t xml:space="preserve">: Variance-component summary (sampling-to-other ratio).</w:t>
+      </w:r>
+    </w:p>
+    <w:p>
+      <w:pPr>
+        <w:pStyle w:val="Compact"/>
+        <w:numPr>
+          <w:ilvl w:val="0"/>
+          <w:numId w:val="1003"/>
+        </w:numPr>
+      </w:pPr>
+      <w:r>
+        <w:rPr>
+          <w:b/>
+          <w:bCs/>
+        </w:rPr>
+        <w:t xml:space="preserve">Supplementary Methods S1.6</w:t>
+      </w:r>
+      <w:r>
+        <w:t xml:space="preserve">: Simplified spring-temperature model (analysis 2).</w:t>
+      </w:r>
+    </w:p>
+    <w:p>
+      <w:pPr>
+        <w:pStyle w:val="Compact"/>
+        <w:numPr>
+          <w:ilvl w:val="0"/>
+          <w:numId w:val="1003"/>
+        </w:numPr>
+      </w:pPr>
+      <w:r>
+        <w:rPr>
+          <w:b/>
+          <w:bCs/>
+        </w:rPr>
+        <w:t xml:space="preserve">Supplementary Methods S1.7</w:t>
+      </w:r>
+      <w:r>
+        <w:t xml:space="preserve">: Reporting recommendations for future MPM studies.</w:t>
+      </w:r>
+    </w:p>
+    <w:p>
+      <w:pPr>
+        <w:pStyle w:val="Compact"/>
+        <w:numPr>
+          <w:ilvl w:val="0"/>
+          <w:numId w:val="1003"/>
+        </w:numPr>
+      </w:pPr>
+      <w:r>
+        <w:rPr>
+          <w:b/>
+          <w:bCs/>
+        </w:rPr>
+        <w:t xml:space="preserve">Supplementary Methods S1.8</w:t>
+      </w:r>
+      <w:r>
+        <w:t xml:space="preserve">: Species identities in analysis 1.</w:t>
+      </w:r>
+    </w:p>
+    <w:p>
+      <w:pPr>
+        <w:pStyle w:val="Compact"/>
+        <w:numPr>
+          <w:ilvl w:val="0"/>
+          <w:numId w:val="1003"/>
+        </w:numPr>
+      </w:pPr>
+      <w:r>
+        <w:rPr>
+          <w:b/>
+          <w:bCs/>
+        </w:rPr>
+        <w:t xml:space="preserve">Table S1</w:t>
+      </w:r>
+      <w:r>
+        <w:t xml:space="preserve">: Single-MPM derived-parameter summary for the focal</w:t>
+      </w:r>
+      <w:r>
+        <w:t xml:space="preserve"> </w:t>
+      </w:r>
+      <w:r>
+        <w:rPr>
+          <w:i/>
+          <w:iCs/>
+        </w:rPr>
+        <w:t xml:space="preserve">Agrimonia eupatoria</w:t>
+      </w:r>
+      <w:r>
+        <w:t xml:space="preserve"> </w:t>
+      </w:r>
+      <w:r>
+        <w:t xml:space="preserve">example.</w:t>
+      </w:r>
+    </w:p>
+    <w:p>
+      <w:pPr>
+        <w:pStyle w:val="Compact"/>
+        <w:numPr>
+          <w:ilvl w:val="0"/>
+          <w:numId w:val="1003"/>
+        </w:numPr>
+      </w:pPr>
+      <w:r>
+        <w:rPr>
+          <w:b/>
+          <w:bCs/>
+        </w:rPr>
+        <w:t xml:space="preserve">Table S2</w:t>
+      </w:r>
+      <w:r>
+        <w:t xml:space="preserve">: Mean-MPM derived-parameter summary for the focal</w:t>
+      </w:r>
+      <w:r>
+        <w:t xml:space="preserve"> </w:t>
+      </w:r>
+      <w:r>
+        <w:rPr>
+          <w:i/>
+          <w:iCs/>
+        </w:rPr>
+        <w:t xml:space="preserve">Agrimonia eupatoria</w:t>
+      </w:r>
+      <w:r>
+        <w:t xml:space="preserve"> </w:t>
+      </w:r>
+      <w:r>
+        <w:t xml:space="preserve">example (population B).</w:t>
+      </w:r>
+    </w:p>
+    <w:p>
+      <w:pPr>
+        <w:pStyle w:val="Compact"/>
+        <w:numPr>
+          <w:ilvl w:val="0"/>
+          <w:numId w:val="1003"/>
+        </w:numPr>
+      </w:pPr>
+      <w:r>
+        <w:rPr>
+          <w:b/>
+          <w:bCs/>
+        </w:rPr>
+        <w:t xml:space="preserve">Table S3</w:t>
+      </w:r>
+      <w:r>
+        <w:t xml:space="preserve">: Analysis 1 posterior summary for the slope parameter (β) in the life expectancy-shape model.</w:t>
+      </w:r>
+    </w:p>
+    <w:p>
+      <w:pPr>
+        <w:pStyle w:val="Compact"/>
+        <w:numPr>
+          <w:ilvl w:val="0"/>
+          <w:numId w:val="1003"/>
+        </w:numPr>
+      </w:pPr>
+      <w:r>
+        <w:rPr>
+          <w:b/>
+          <w:bCs/>
+        </w:rPr>
+        <w:t xml:space="preserve">Table S4</w:t>
+      </w:r>
+      <w:r>
+        <w:t xml:space="preserve">: Analysis 2 Gaussian-process regression coefficients (monthly lags) for recruitment responses to temperature anomalies.</w:t>
+      </w:r>
+    </w:p>
+    <w:p>
+      <w:pPr>
+        <w:pStyle w:val="Compact"/>
+        <w:numPr>
+          <w:ilvl w:val="0"/>
+          <w:numId w:val="1003"/>
+        </w:numPr>
+      </w:pPr>
+      <w:r>
+        <w:rPr>
+          <w:b/>
+          <w:bCs/>
+        </w:rPr>
+        <w:t xml:space="preserve">Table S5</w:t>
+      </w:r>
+      <w:r>
+        <w:t xml:space="preserve">: Analysis 2 posterior summary for the spring-temperature coefficient.</w:t>
+      </w:r>
+    </w:p>
+    <w:p>
+      <w:pPr>
+        <w:pStyle w:val="Compact"/>
+        <w:numPr>
+          <w:ilvl w:val="0"/>
+          <w:numId w:val="1003"/>
+        </w:numPr>
+      </w:pPr>
+      <w:r>
+        <w:rPr>
+          <w:b/>
+          <w:bCs/>
+        </w:rPr>
+        <w:t xml:space="preserve">Table S6</w:t>
+      </w:r>
+      <w:r>
+        <w:t xml:space="preserve">: Primary studies represented in the analysis subset, as identified in COMPADRE.</w:t>
+      </w:r>
+    </w:p>
+    <w:p>
+      <w:pPr>
+        <w:pStyle w:val="Compact"/>
+        <w:numPr>
+          <w:ilvl w:val="0"/>
+          <w:numId w:val="1003"/>
+        </w:numPr>
+      </w:pPr>
+      <w:r>
+        <w:rPr>
+          <w:b/>
+          <w:bCs/>
+        </w:rPr>
+        <w:t xml:space="preserve">Figure S1</w:t>
+      </w:r>
+      <w:r>
+        <w:t xml:space="preserve">: Boundary-estimate diagnostic.</w:t>
+      </w:r>
+    </w:p>
+    <w:p>
+      <w:pPr>
+        <w:pStyle w:val="Compact"/>
+        <w:numPr>
+          <w:ilvl w:val="0"/>
+          <w:numId w:val="1003"/>
+        </w:numPr>
+      </w:pPr>
+      <w:r>
+        <w:rPr>
+          <w:b/>
+          <w:bCs/>
+        </w:rPr>
+        <w:t xml:space="preserve">Figure S2</w:t>
+      </w:r>
+      <w:r>
+        <w:t xml:space="preserve">: Illustration of survivorship trajectories under boundary survival transitions.</w:t>
+      </w:r>
+    </w:p>
     <w:p>
       <w:r>
         <w:br w:type="page"/>
       </w:r>
     </w:p>
-    <w:bookmarkEnd w:id="44"/>
-    <w:bookmarkStart w:id="48" w:name="references"/>
+    <w:bookmarkEnd w:id="47"/>
+    <w:bookmarkStart w:id="51" w:name="references"/>
     <w:p>
       <w:pPr>
         <w:pStyle w:val="Heading1"/>
@@ -5478,7 +6043,7 @@
       <w:r>
         <w:t xml:space="preserve"> </w:t>
       </w:r>
-      <w:hyperlink r:id="rId45">
+      <w:hyperlink r:id="rId48">
         <w:r>
           <w:rPr>
             <w:rStyle w:val="Hyperlink"/>
@@ -5875,7 +6440,7 @@
       <w:r>
         <w:t xml:space="preserve"> </w:t>
       </w:r>
-      <w:hyperlink r:id="rId46">
+      <w:hyperlink r:id="rId49">
         <w:r>
           <w:rPr>
             <w:rStyle w:val="Hyperlink"/>
@@ -5894,7 +6459,7 @@
       <w:r>
         <w:t xml:space="preserve"> </w:t>
       </w:r>
-      <w:hyperlink r:id="rId47">
+      <w:hyperlink r:id="rId50">
         <w:r>
           <w:rPr>
             <w:rStyle w:val="Hyperlink"/>
@@ -5950,8 +6515,8 @@
         <w:br w:type="page"/>
       </w:r>
     </w:p>
-    <w:bookmarkEnd w:id="48"/>
-    <w:bookmarkStart w:id="50" w:name="tables"/>
+    <w:bookmarkEnd w:id="51"/>
+    <w:bookmarkStart w:id="53" w:name="tables"/>
     <w:p>
       <w:pPr>
         <w:pStyle w:val="Heading1"/>
@@ -5964,8 +6529,8 @@
       <w:pPr>
         <w:pStyle w:val="TableCaption"/>
       </w:pPr>
-      <w:bookmarkStart w:id="49" w:name="tab:table-case1-var"/>
-      <w:bookmarkEnd w:id="49"/>
+      <w:bookmarkStart w:id="52" w:name="tab:table-case1-var"/>
+      <w:bookmarkEnd w:id="52"/>
       <w:r>
         <w:t xml:space="preserve">Table 1:</w:t>
       </w:r>
@@ -5973,7 +6538,7 @@
         <w:t xml:space="preserve"> </w:t>
       </w:r>
       <w:r>
-        <w:t xml:space="preserve">Sampling-to-other variance ratios for key demographic parameters in case study 1. Ratios greater than 1 indicate that variance attributable to transition-rate sampling uncertainty exceeds residual biological variance among populations/species. The table shows that this ratio is highest for shape, intermediate for life expectancy, and lowest for log population growth rate.</w:t>
+        <w:t xml:space="preserve">Sampling-to-other variance ratios for key demographic parameters in analysis 1. Ratios greater than 1 indicate that variance attributable to transition-rate sampling uncertainty exceeds residual biological variance across population-level entries (including both among-population and among-species variation). The table shows that this ratio is highest for shape, intermediate for life expectancy, and lowest for log population growth rate.</w:t>
       </w:r>
     </w:p>
     <w:tbl xmlns:w="http://schemas.openxmlformats.org/wordprocessingml/2006/main" xmlns:r="http://schemas.openxmlformats.org/officeDocument/2006/relationships" xmlns:w14="http://schemas.microsoft.com/office/word/2010/wordml" xmlns:wp="http://schemas.openxmlformats.org/drawingml/2006/wordprocessingDrawing" xmlns:a="http://schemas.openxmlformats.org/drawingml/2006/main" xmlns:pic="http://schemas.openxmlformats.org/drawingml/2006/picture">
@@ -5983,7 +6548,7 @@
         <w:tblLook w:firstRow="1" w:lastRow="0" w:firstColumn="0" w:lastColumn="0" w:noHBand="0" w:noVBand="1"/>
       </w:tblPr>
       <w:tblGrid>
-        <w:gridCol w:w="3016"/>
+        <w:gridCol w:w="3431"/>
         <w:gridCol w:w="3272"/>
       </w:tblGrid>
       <w:tr>
@@ -6210,7 +6775,7 @@
                 <w:szCs w:val="22"/>
                 <w:color w:val="000000"/>
               </w:rPr>
-              <w:t xml:space="preserve">3.29</w:t>
+              <w:t xml:space="preserve">3.28</w:t>
             </w:r>
           </w:p>
         </w:tc>
@@ -6445,7 +7010,7 @@
       </w:tr>
       <w:tr>
         <w:trPr>
-          <w:trHeight w:val="615" w:hRule="auto"/>
+          <w:trHeight w:val="617" w:hRule="auto"/>
         </w:trPr>
         body4
         <w:tc>
@@ -6498,7 +7063,7 @@
                 <w:szCs w:val="22"/>
                 <w:color w:val="000000"/>
               </w:rPr>
-              <w:t xml:space="preserve">damp</w:t>
+              <w:t xml:space="preserve">Damping ratio</w:t>
             </w:r>
           </w:p>
         </w:tc>
@@ -6552,7 +7117,7 @@
                 <w:szCs w:val="22"/>
                 <w:color w:val="000000"/>
               </w:rPr>
-              <w:t xml:space="preserve">1.07</w:t>
+              <w:t xml:space="preserve">1.06</w:t>
             </w:r>
           </w:p>
         </w:tc>
@@ -6612,7 +7177,7 @@
                 <w:szCs w:val="22"/>
                 <w:color w:val="000000"/>
               </w:rPr>
-              <w:t xml:space="preserve">gen</w:t>
+              <w:t xml:space="preserve">Generation time</w:t>
             </w:r>
           </w:p>
         </w:tc>
@@ -6673,7 +7238,7 @@
       </w:tr>
       <w:tr>
         <w:trPr>
-          <w:trHeight w:val="604" w:hRule="auto"/>
+          <w:trHeight w:val="619" w:hRule="auto"/>
         </w:trPr>
         body6
         <w:tc>
@@ -6726,7 +7291,7 @@
                 <w:szCs w:val="22"/>
                 <w:color w:val="000000"/>
               </w:rPr>
-              <w:t xml:space="preserve">pmature</w:t>
+              <w:t xml:space="preserve">Probability of reaching maturity</w:t>
             </w:r>
           </w:p>
         </w:tc>
@@ -6780,7 +7345,7 @@
                 <w:szCs w:val="22"/>
                 <w:color w:val="000000"/>
               </w:rPr>
-              <w:t xml:space="preserve">1.59</w:t>
+              <w:t xml:space="preserve">1.58</w:t>
             </w:r>
           </w:p>
         </w:tc>
@@ -6791,8 +7356,8 @@
         <w:br w:type="page"/>
       </w:r>
     </w:p>
-    <w:bookmarkEnd w:id="50"/>
-    <w:bookmarkStart w:id="71" w:name="figures"/>
+    <w:bookmarkEnd w:id="53"/>
+    <w:bookmarkStart w:id="74" w:name="figures"/>
     <w:p>
       <w:pPr>
         <w:pStyle w:val="Heading1"/>
@@ -6810,18 +7375,18 @@
           <wp:inline>
             <wp:extent cx="5943600" cy="1981199"/>
             <wp:effectExtent b="0" l="0" r="0" t="0"/>
-            <wp:docPr descr="Figure 1: Sampling distributions of transition rates for the focal single-MPM example (Agrimonia eupatoria, population B). Point estimates are compared with bootstrap-based uncertainty distributions derived from observed transition counts, showing that several matrix elements are weakly estimated from finite samples." title="" id="52" name="Picture"/>
+            <wp:docPr descr="Figure 1: Sampling distributions of transition rates for the focal single-MPM example (Agrimonia eupatoria, population B), showing transition rates as reported in COMPADRE (A), the underlying transition counts used for estimation (B), and bootstrap-based sampling distributions (C). Together, these panels show that several matrix elements are weakly estimated from finite samples." title="" id="55" name="Picture"/>
             <a:graphic>
               <a:graphicData uri="http://schemas.openxmlformats.org/drawingml/2006/picture">
                 <pic:pic>
                   <pic:nvPicPr>
-                    <pic:cNvPr descr="../../figures/fig1_top.png" id="53" name="Picture"/>
+                    <pic:cNvPr descr="../../figures/fig1_top.png" id="56" name="Picture"/>
                     <pic:cNvPicPr>
                       <a:picLocks noChangeArrowheads="1" noChangeAspect="1"/>
                     </pic:cNvPicPr>
                   </pic:nvPicPr>
                   <pic:blipFill>
-                    <a:blip r:embed="rId51"/>
+                    <a:blip r:embed="rId54"/>
                     <a:stretch>
                       <a:fillRect/>
                     </a:stretch>
@@ -6852,8 +7417,8 @@
       <w:pPr>
         <w:pStyle w:val="ImageCaption"/>
       </w:pPr>
-      <w:bookmarkStart w:id="54" w:name="fig:fig-main-1a"/>
-      <w:bookmarkEnd w:id="54"/>
+      <w:bookmarkStart w:id="57" w:name="fig:fig-main-1a"/>
+      <w:bookmarkEnd w:id="57"/>
       <w:r>
         <w:t xml:space="preserve">Figure 1: Sampling distributions of transition rates for the focal single-MPM example (</w:t>
       </w:r>
@@ -6865,7 +7430,7 @@
         <w:t xml:space="preserve">Agrimonia eupatoria</w:t>
       </w:r>
       <w:r>
-        <w:t xml:space="preserve">, population B). Point estimates are compared with bootstrap-based uncertainty distributions derived from observed transition counts, showing that several matrix elements are weakly estimated from finite samples.</w:t>
+        <w:t xml:space="preserve">, population B), showing transition rates as reported in COMPADRE (A), the underlying transition counts used for estimation (B), and bootstrap-based sampling distributions (C). Together, these panels show that several matrix elements are weakly estimated from finite samples.</w:t>
       </w:r>
     </w:p>
     <w:p>
@@ -6882,18 +7447,18 @@
           <wp:inline>
             <wp:extent cx="5943600" cy="2447364"/>
             <wp:effectExtent b="0" l="0" r="0" t="0"/>
-            <wp:docPr descr="Figure 2: Sampling distributions of demographic quantities derived from the focal single MPM. Uncertainty in transition rates propagates to substantial uncertainty in derived parameters, with the largest spread in quantities that depend on long-term survivorship and reproduction." title="" id="56" name="Picture"/>
+            <wp:docPr descr="Figure 2: Sampling distributions of demographic quantities derived from the focal single MPM, including population growth rate (λ), damping ratio (ρ), generation time (T), and life expectancy (l₀). Uncertainty in transition rates propagates to substantial uncertainty in these derived parameters, with the largest spread in quantities that depend on long-term survivorship and reproduction." title="" id="59" name="Picture"/>
             <a:graphic>
               <a:graphicData uri="http://schemas.openxmlformats.org/drawingml/2006/picture">
                 <pic:pic>
                   <pic:nvPicPr>
-                    <pic:cNvPr descr="../../figures/fig1_bottom.png" id="57" name="Picture"/>
+                    <pic:cNvPr descr="../../figures/fig1_bottom.png" id="60" name="Picture"/>
                     <pic:cNvPicPr>
                       <a:picLocks noChangeArrowheads="1" noChangeAspect="1"/>
                     </pic:cNvPicPr>
                   </pic:nvPicPr>
                   <pic:blipFill>
-                    <a:blip r:embed="rId55"/>
+                    <a:blip r:embed="rId58"/>
                     <a:stretch>
                       <a:fillRect/>
                     </a:stretch>
@@ -6924,10 +7489,10 @@
       <w:pPr>
         <w:pStyle w:val="ImageCaption"/>
       </w:pPr>
-      <w:bookmarkStart w:id="58" w:name="fig:fig-main-1b"/>
-      <w:bookmarkEnd w:id="58"/>
-      <w:r>
-        <w:t xml:space="preserve">Figure 2: Sampling distributions of demographic quantities derived from the focal single MPM. Uncertainty in transition rates propagates to substantial uncertainty in derived parameters, with the largest spread in quantities that depend on long-term survivorship and reproduction.</w:t>
+      <w:bookmarkStart w:id="61" w:name="fig:fig-main-1b"/>
+      <w:bookmarkEnd w:id="61"/>
+      <w:r>
+        <w:t xml:space="preserve">Figure 2: Sampling distributions of demographic quantities derived from the focal single MPM, including population growth rate (λ), damping ratio (ρ), generation time (T), and life expectancy (l₀). Uncertainty in transition rates propagates to substantial uncertainty in these derived parameters, with the largest spread in quantities that depend on long-term survivorship and reproduction.</w:t>
       </w:r>
     </w:p>
     <w:p>
@@ -6944,18 +7509,18 @@
           <wp:inline>
             <wp:extent cx="5046020" cy="6880936"/>
             <wp:effectExtent b="0" l="0" r="0" t="0"/>
-            <wp:docPr descr="Figure 3: Case study 1 comparison of point estimates versus sampling-distribution summaries for population-level life expectancy and shape. Distributions are shown for estimates derived directly from matrix point estimates and for uncertainty-aware summaries, showing systematic shifts and shrinkage in extreme values when sampling uncertainty is propagated." title="" id="60" name="Picture"/>
+            <wp:docPr descr="Figure 3: Analysis 1 comparison of point estimates versus sampling-distribution summaries for population-level life expectancy and shape. Panel A shows mortality-trajectory shape, and Panel B shows mature life expectancy. In each panel, distributions are shown for estimates derived directly from matrix point estimates and for uncertainty-aware summaries, showing systematic shifts and shrinkage in extreme values when sampling uncertainty is propagated." title="" id="63" name="Picture"/>
             <a:graphic>
               <a:graphicData uri="http://schemas.openxmlformats.org/drawingml/2006/picture">
                 <pic:pic>
                   <pic:nvPicPr>
-                    <pic:cNvPr descr="../../figures/fig2_shape_l0_distributions.png" id="61" name="Picture"/>
+                    <pic:cNvPr descr="../../figures/fig2_shape_l0_distributions.png" id="64" name="Picture"/>
                     <pic:cNvPicPr>
                       <a:picLocks noChangeArrowheads="1" noChangeAspect="1"/>
                     </pic:cNvPicPr>
                   </pic:nvPicPr>
                   <pic:blipFill>
-                    <a:blip r:embed="rId59"/>
+                    <a:blip r:embed="rId62"/>
                     <a:stretch>
                       <a:fillRect/>
                     </a:stretch>
@@ -6986,10 +7551,10 @@
       <w:pPr>
         <w:pStyle w:val="ImageCaption"/>
       </w:pPr>
-      <w:bookmarkStart w:id="62" w:name="fig:fig-main-2"/>
-      <w:bookmarkEnd w:id="62"/>
-      <w:r>
-        <w:t xml:space="preserve">Figure 3: Case study 1 comparison of point estimates versus sampling-distribution summaries for population-level life expectancy and shape. Distributions are shown for estimates derived directly from matrix point estimates and for uncertainty-aware summaries, showing systematic shifts and shrinkage in extreme values when sampling uncertainty is propagated.</w:t>
+      <w:bookmarkStart w:id="65" w:name="fig:fig-main-2"/>
+      <w:bookmarkEnd w:id="65"/>
+      <w:r>
+        <w:t xml:space="preserve">Figure 3: Analysis 1 comparison of point estimates versus sampling-distribution summaries for population-level life expectancy and shape. Panel A shows mortality-trajectory shape, and Panel B shows mature life expectancy. In each panel, distributions are shown for estimates derived directly from matrix point estimates and for uncertainty-aware summaries, showing systematic shifts and shrinkage in extreme values when sampling uncertainty is propagated.</w:t>
       </w:r>
     </w:p>
     <w:p>
@@ -7006,18 +7571,18 @@
           <wp:inline>
             <wp:extent cx="5943600" cy="2936837"/>
             <wp:effectExtent b="0" l="0" r="0" t="0"/>
-            <wp:docPr descr="Figure 4: Case study 1 relationship between life expectancy and shape under models with and without uncertainty propagation. Panel A shows data support after replacing point estimates with sampling-distribution summaries; panel B shows posterior distributions for the slope parameter (β). This figure shows that accounting for sampling uncertainty shifts posterior support towards a positive association." title="" id="64" name="Picture"/>
+            <wp:docPr descr="Figure 4: Analysis 1 relationship between life expectancy and shape under models with and without sampling uncertainty propagation. In panel A, open circles are point estimates, while crosses are centred on sampling-distribution medians with horizontal and vertical bars showing 95% intervals. Panel B shows posterior distributions for the slope parameter (β). This figure shows that accounting for sampling uncertainty shifts posterior support towards a positive association." title="" id="67" name="Picture"/>
             <a:graphic>
               <a:graphicData uri="http://schemas.openxmlformats.org/drawingml/2006/picture">
                 <pic:pic>
                   <pic:nvPicPr>
-                    <pic:cNvPr descr="../../figures/fig3_shape_l0_regression.png" id="65" name="Picture"/>
+                    <pic:cNvPr descr="../../figures/fig3_shape_l0_regression.png" id="68" name="Picture"/>
                     <pic:cNvPicPr>
                       <a:picLocks noChangeArrowheads="1" noChangeAspect="1"/>
                     </pic:cNvPicPr>
                   </pic:nvPicPr>
                   <pic:blipFill>
-                    <a:blip r:embed="rId63"/>
+                    <a:blip r:embed="rId66"/>
                     <a:stretch>
                       <a:fillRect/>
                     </a:stretch>
@@ -7048,10 +7613,10 @@
       <w:pPr>
         <w:pStyle w:val="ImageCaption"/>
       </w:pPr>
-      <w:bookmarkStart w:id="66" w:name="fig:fig-main-3"/>
-      <w:bookmarkEnd w:id="66"/>
-      <w:r>
-        <w:t xml:space="preserve">Figure 4: Case study 1 relationship between life expectancy and shape under models with and without uncertainty propagation. Panel A shows data support after replacing point estimates with sampling-distribution summaries; panel B shows posterior distributions for the slope parameter (β). This figure shows that accounting for sampling uncertainty shifts posterior support towards a positive association.</w:t>
+      <w:bookmarkStart w:id="69" w:name="fig:fig-main-3"/>
+      <w:bookmarkEnd w:id="69"/>
+      <w:r>
+        <w:t xml:space="preserve">Figure 4: Analysis 1 relationship between life expectancy and shape under models with and without sampling uncertainty propagation. In panel A, open circles are point estimates, while crosses are centred on sampling-distribution medians with horizontal and vertical bars showing 95% intervals. Panel B shows posterior distributions for the slope parameter (β). This figure shows that accounting for sampling uncertainty shifts posterior support towards a positive association.</w:t>
       </w:r>
     </w:p>
     <w:p>
@@ -7068,18 +7633,18 @@
           <wp:inline>
             <wp:extent cx="5734113" cy="4128561"/>
             <wp:effectExtent b="0" l="0" r="0" t="0"/>
-            <wp:docPr descr="Figure 5: Case study 2 climate effects on recruitment in Silene spaldingii. Monthly-lag and spring-temperature models are shown for both point-estimate and uncertainty-aware formulations; posterior coefficient estimates and interval widths are similar across formulations, showing limited sensitivity of this analysis to transition-rate sampling uncertainty." title="" id="68" name="Picture"/>
+            <wp:docPr descr="Figure 5: Analysis 2 climate effects on recruitment in Silene spaldingii. Monthly-lag and spring-temperature models are shown for both point-estimate and uncertainty-aware formulations; posterior coefficient estimates and interval widths are similar across formulations, showing limited sensitivity of this analysis to transition-rate sampling uncertainty." title="" id="71" name="Picture"/>
             <a:graphic>
               <a:graphicData uri="http://schemas.openxmlformats.org/drawingml/2006/picture">
                 <pic:pic>
                   <pic:nvPicPr>
-                    <pic:cNvPr descr="../../figures/clim.png" id="69" name="Picture"/>
+                    <pic:cNvPr descr="../../figures/clim.png" id="72" name="Picture"/>
                     <pic:cNvPicPr>
                       <a:picLocks noChangeArrowheads="1" noChangeAspect="1"/>
                     </pic:cNvPicPr>
                   </pic:nvPicPr>
                   <pic:blipFill>
-                    <a:blip r:embed="rId67"/>
+                    <a:blip r:embed="rId70"/>
                     <a:stretch>
                       <a:fillRect/>
                     </a:stretch>
@@ -7110,10 +7675,10 @@
       <w:pPr>
         <w:pStyle w:val="ImageCaption"/>
       </w:pPr>
-      <w:bookmarkStart w:id="70" w:name="fig:fig-main-4"/>
-      <w:bookmarkEnd w:id="70"/>
-      <w:r>
-        <w:t xml:space="preserve">Figure 5: Case study 2 climate effects on recruitment in</w:t>
+      <w:bookmarkStart w:id="73" w:name="fig:fig-main-4"/>
+      <w:bookmarkEnd w:id="73"/>
+      <w:r>
+        <w:t xml:space="preserve">Figure 5: Analysis 2 climate effects on recruitment in</w:t>
       </w:r>
       <w:r>
         <w:t xml:space="preserve"> </w:t>
@@ -7129,7 +7694,7 @@
         <w:t xml:space="preserve">. Monthly-lag and spring-temperature models are shown for both point-estimate and uncertainty-aware formulations; posterior coefficient estimates and interval widths are similar across formulations, showing limited sensitivity of this analysis to transition-rate sampling uncertainty.</w:t>
       </w:r>
     </w:p>
-    <w:bookmarkEnd w:id="71"/>
+    <w:bookmarkEnd w:id="74"/>
     <w:sectPr>
       <w:footnotePr>
         <w:numRestart w:val="eachSect"/>
@@ -7545,6 +8110,9 @@
     </w:lvlOverride>
   </w:num>
   <w:num w:numId="1002">
+    <w:abstractNumId w:val="991"/>
+  </w:num>
+  <w:num w:numId="1003">
     <w:abstractNumId w:val="991"/>
   </w:num>
 </w:numbering>

</xml_diff>

<commit_message>
Updates to align with latest COMPADRE release
</commit_message>
<xml_diff>
--- a/docs/manuscript/sampling_uncertainty_mpm_main.docx
+++ b/docs/manuscript/sampling_uncertainty_mpm_main.docx
@@ -299,7 +299,7 @@
         <w:pStyle w:val="FirstParagraph"/>
       </w:pPr>
       <w:r>
-        <w:t xml:space="preserve">We used the COMPADRE database to identify an initial group of 91 studies from which we sought data. The initial search criteria were: studies published from 2010 onwards; species of common perennial growth forms (herbaceous, shrub, tree, palm, and succulent); wild populations not subjected to experimental treatments; and MPMs with three or more stage classes and a one-year projection interval. Of these, we obtained the data required to model sampling uncertainty for 28: most exclusions reflected insufficient reporting of transition-specific sample sizes, and a small number used estimation methods incompatible with our bootstrapping approach (e.g. mark-recapture or multi-stage vital rate products). We cannot rule out selection bias, but have no strong reason to expect systematic differences between included and excluded studies. The 28 studies yielded 298 MPMs for 73 populations of 27 species. We supplemented this set with 5 additional studies published before 2010 for which we had previously obtained data (targeted based on a criterion of at least 4 years of temporal replication), giving a final set of 33 studies representing 325 MPMs for 82 populations of 32 species.</w:t>
+        <w:t xml:space="preserve">We used COMPADRE version 6.26.3.0 (created Mar_11_2026) to identify an initial group of 91 studies from which we sought data. The initial search criteria were: studies published from 2010 onwards; species of common perennial growth forms (herbaceous, shrub, tree, palm, and succulent); wild populations not subjected to experimental treatments; and MPMs with three or more stage classes and a one-year projection interval. Of these, we obtained the data required to model sampling uncertainty for 28: most exclusions reflected insufficient reporting of transition-specific sample sizes, and a small number used estimation methods incompatible with our bootstrapping approach (e.g. mark-recapture or multi-stage vital rate products). We cannot rule out selection bias, but have no strong reason to expect systematic differences between included and excluded studies. The 28 studies yielded 298 MPMs for 73 populations of 27 species. We supplemented this set with 5 additional studies published before 2010 for which we had previously obtained data (targeted based on a criterion of at least 4 years of temporal replication), giving a final set of 33 studies representing 325 MPMs for 82 populations of 32 species.</w:t>
       </w:r>
     </w:p>
     <w:bookmarkEnd w:id="27"/>
@@ -1119,7 +1119,7 @@
         <w:pStyle w:val="FirstParagraph"/>
       </w:pPr>
       <w:r>
-        <w:t xml:space="preserve">We chose parametric bootstrapping because the sampling distributions of survival and reproductive transitions follow well-characterised probability models (multinomial and Poisson, respectively) whose parameters can be directly estimated from the transition frequencies reported in source studies. This makes parametric bootstrapping more tractable than MCMC for our scale of analysis and more principled than the empirical bootstrap, which cannot generate variation when all individuals in a stage class experience the same outcome (e.g. all survive), a situation common in published matrices.</w:t>
+        <w:t xml:space="preserve">We chose parametric bootstrapping because the sampling distributions of survival and reproductive transitions follow well-characterised probability models (multinomial and Poisson, respectively) whose parameters can be directly estimated from the transition frequencies reported in source studies. This makes parametric bootstrapping more tractable than MCMC for our scale of analysis and more principled than the empirical bootstrap, which cannot generate variation when all individuals in a stage class experience the same outcome (e.g. all survive), a situation common in published matrices. When a stage-specific sample size was recovered as zero, we retained the published point-estimate transition column unchanged in all bootstrap draws rather than treating it as a structural zero. In such cases, the matrix remains usable in the same way it would be in a comparative database analysis, but no additional sampling variation is propagated for that unsupported column.</w:t>
       </w:r>
     </w:p>
     <w:bookmarkStart w:id="30" w:name="illustrative-example"/>
@@ -3027,7 +3027,7 @@
         <w:pStyle w:val="BodyText"/>
       </w:pPr>
       <w:r>
-        <w:t xml:space="preserve">We calculated life expectancy and shape at the population level, as defined in COMPADRE. For populations with temporal replication (i.e., MPMs across multiple time periods), we used the pooled population MPM in our analysis, if available; otherwise, we used the population mean MPM. To model sampling uncertainty for pooled or mean MPMs, we pooled stage-specific sample sizes across years (see Supplementary Methods section S1.3). This approach ignores uncertainty arising from temporal variation in transition rates and therefore underestimates overall uncertainty in the pooled estimates. The degree of underestimation depends on how much transition rates vary across years relative to within-year sampling error; for species with high interannual variability, the bias could be substantial. Results should therefore be interpreted conservatively with respect to the influence of sampling uncertainty.</w:t>
+        <w:t xml:space="preserve">We calculated life expectancy and shape at the population level, using one population-level MPM per population. For populations with temporal replication, we used a pooled population MPM if available; otherwise, we used a population mean MPM; if neither was available, we constructed a population-level matrix by taking the element-wise mean of the available annual individual MPMs. When database records included both site-specific populations and aggregate population labels (e.g. combined multi-site entries), we retained the site-specific populations and excluded the aggregate rows to avoid double counting. To model sampling uncertainty for pooled or mean population-level MPMs, we pooled stage-specific sample sizes across years (see Supplementary Methods section S1.3). This approach ignores uncertainty arising from temporal variation in transition rates and therefore underestimates overall uncertainty in the pooled estimates. The degree of underestimation depends on how much transition rates vary across years relative to within-year sampling error; for species with high interannual variability, the bias could be substantial. Results should therefore be interpreted conservatively with respect to the influence of sampling uncertainty.</w:t>
       </w:r>
     </w:p>
     <w:p>
@@ -6019,7 +6019,7 @@
         <w:pStyle w:val="BodyText"/>
       </w:pPr>
       <w:r>
-        <w:t xml:space="preserve">For our parameters of interest, life expectancy and shape, the estimated sampling-to-other variance ratios across population-level MPM entries in analysis 1 were 2.00 and 3.28, respectively (Table</w:t>
+        <w:t xml:space="preserve">For our parameters of interest, life expectancy and shape, the estimated sampling-to-other variance ratios across population-level MPM entries in analysis 1 were 1.93 and 3.31, respectively (Table</w:t>
       </w:r>
       <w:r>
         <w:t xml:space="preserve"> </w:t>
@@ -6054,7 +6054,7 @@
         <w:t xml:space="preserve">4</w:t>
       </w:r>
       <w:r>
-        <w:t xml:space="preserve">). For the slope parameter β, the posterior distribution from the point-estimate model was centred slightly to the left of zero (P[β &gt; 0] = 0.258), whereas the corresponding posterior from the sampling-uncertainty model was shifted somewhat to the right (P[β &gt; 0] = 0.646), indicating stronger evidence for a positive relationship between life expectancy and shape.</w:t>
+        <w:t xml:space="preserve">). For the slope parameter β, the posterior distribution from the point-estimate model was centred slightly to the left of zero (P[β &gt; 0] = 0.146), whereas the corresponding posterior from the sampling-uncertainty model was shifted somewhat to the right (P[β &gt; 0] = 0.770), indicating stronger evidence for a positive relationship between life expectancy and shape.</w:t>
       </w:r>
     </w:p>
     <w:p>
@@ -6181,7 +6181,7 @@
         <w:pStyle w:val="BodyText"/>
       </w:pPr>
       <w:r>
-        <w:t xml:space="preserve">For spring-temperature models, posterior medians differed only slightly between formulations (maximum absolute within-site difference: 0.026 on the linear predictor scale), and 95% interval widths changed by only -5.3% to 4.7% across sites (Supplementary Table S8). Monthly-lag coefficient profiles were likewise highly concordant between formulations, with within-site correlations of posterior medians ranging from 0.986 to 0.995 and a maximum lag-specific median difference of 0.039 (Fig.</w:t>
+        <w:t xml:space="preserve">For spring-temperature models, posterior medians differed only slightly between formulations (maximum absolute within-site difference: 0.026 on the linear predictor scale), and 95% interval widths changed by only -5.3% to 4.7% across sites (Supplementary Table S8). Monthly-lag coefficient profiles were likewise highly concordant between formulations, with within-site correlations of posterior medians ranging from 0.992 to 0.997 and a maximum lag-specific median difference of 0.042 (Fig.</w:t>
       </w:r>
       <w:r>
         <w:t xml:space="preserve"> </w:t>
@@ -6285,14 +6285,14 @@
           <m:t>=</m:t>
         </m:r>
         <m:r>
-          <m:t>67</m:t>
+          <m:t>68</m:t>
         </m:r>
       </m:oMath>
       <w:r>
         <w:t xml:space="preserve"> </w:t>
       </w:r>
       <w:r>
-        <w:t xml:space="preserve">matrices), 35% (23/67) contain only a single reproductive stage class, 28% (19/67) reach their quasi-stable distribution in less than one life expectancy, and 24% (16/67) contain at least one stage-specific survival estimate of exactly 100%. These are not rare edge cases; they are routine features of published matrices that systematically displace derived trait estimates from the centre of their sampling distributions.</w:t>
+        <w:t xml:space="preserve">population-level matrices), 47% (32/68) contain only a single reproductive stage class, 69% (47/68) reach their quasi-stable distribution in less than one life expectancy, and 46% (31/68) contain at least one stage-specific survival estimate of exactly 100%. These are not rare edge cases; they are routine features of published matrices that systematically displace derived trait estimates from the centre of their sampling distributions.</w:t>
       </w:r>
     </w:p>
     <w:bookmarkEnd w:id="41"/>
@@ -8482,7 +8482,7 @@
                 <w:szCs w:val="22"/>
                 <w:color w:val="000000"/>
               </w:rPr>
-              <w:t xml:space="preserve">3.28</w:t>
+              <w:t xml:space="preserve">3.31</w:t>
             </w:r>
           </w:p>
         </w:tc>
@@ -8596,7 +8596,7 @@
                 <w:szCs w:val="22"/>
                 <w:color w:val="000000"/>
               </w:rPr>
-              <w:t xml:space="preserve">2.00</w:t>
+              <w:t xml:space="preserve">1.93</w:t>
             </w:r>
           </w:p>
         </w:tc>
@@ -8824,7 +8824,7 @@
                 <w:szCs w:val="22"/>
                 <w:color w:val="000000"/>
               </w:rPr>
-              <w:t xml:space="preserve">1.06</w:t>
+              <w:t xml:space="preserve">1.12</w:t>
             </w:r>
           </w:p>
         </w:tc>
@@ -8938,7 +8938,7 @@
                 <w:szCs w:val="22"/>
                 <w:color w:val="000000"/>
               </w:rPr>
-              <w:t xml:space="preserve">1.62</w:t>
+              <w:t xml:space="preserve">1.63</w:t>
             </w:r>
           </w:p>
         </w:tc>
@@ -9052,7 +9052,7 @@
                 <w:szCs w:val="22"/>
                 <w:color w:val="000000"/>
               </w:rPr>
-              <w:t xml:space="preserve">1.58</w:t>
+              <w:t xml:space="preserve">1.62</w:t>
             </w:r>
           </w:p>
         </w:tc>

</xml_diff>

<commit_message>
minor changes to text
</commit_message>
<xml_diff>
--- a/docs/manuscript/sampling_uncertainty_mpm_main.docx
+++ b/docs/manuscript/sampling_uncertainty_mpm_main.docx
@@ -160,7 +160,7 @@
         </w:numPr>
       </w:pPr>
       <w:r>
-        <w:t xml:space="preserve">The effects of sampling uncertainty were strongly trait-dependent. It had little influence on integrated demographic metrics such as population growth rate, but accounted for a substantial fraction of the total variation in traits related to mortality trajectories, particularly the shape of the mortality distribution. In these cases, point estimates were often systematically displaced from their underlying sampling distributions due to boundary estimates of stage-specific survival (i.e. survival probabilities near 0 or 1), which are common in published matrices. By contrast, inference in a within-species analysis of weather effects on recruitment was largely unaffected.</w:t>
+        <w:t xml:space="preserve">The effects of sampling uncertainty were strongly trait-dependent. It had little influence on integrated demographic metrics such as population growth rate, but accounted for a substantial fraction of the total variation in traits related to mortality trajectories, particularly the shape of the mortality distribution. In these cases, point estimates were often systematically displaced from their underlying sampling distributions due to boundary estimates of stage-specific survival (i.e. survival probabilities near 0 or 1), which are common in published matrices. By contrast, inference in a within-species analysis of weather effects on vital rates was largely unaffected.</w:t>
       </w:r>
     </w:p>
     <w:p>
@@ -242,7 +242,7 @@
         <w:pStyle w:val="BodyText"/>
       </w:pPr>
       <w:r>
-        <w:t xml:space="preserve">Our aim is to examine how sampling uncertainty in published projection matrices propagates to specific MPM-derived quantities and to explore when point estimates are robust or fragile. We expect sensitivity to vary systematically across traits, reflecting a spectrum from highly integrated metrics — such as population growth rate, which averages over many transitions and should be buffered against uncertainty in any single element — to traits that depend on long-term survivorship inferred indirectly via age-from-stage methods, such as life expectancy and mortality shape, where small errors in late-stage survival can amplify into large errors in derived quantities. We structure our three analyses to bracket this spectrum deliberately. The focal quantities are mature life expectancy, the shape of the mortality trajectory, log population growth rate, and recruitment-climate regression coefficients. Because COMPADRE does not routinely include transition-level sample sizes, our analysis is restricted to the subset for which these data could be assembled (325 MPMs from 33 studies; details in Methods). We illustrate trait-dependent uncertainty effects using a multi-species comparative analysis of life expectancy-shape relationships (analysis 1), a single-species time-series analysis of weather effects on recruitment (analysis 2), and a multi-site extension of the same climate-demography framework (analysis 3), and use these to identify diagnostic features that help researchers assess robustness in their own work.</w:t>
+        <w:t xml:space="preserve">Our aim is to examine how sampling uncertainty in published projection matrices propagates to specific MPM-derived quantities and to explore when point estimates are robust or fragile. We expect sensitivity to vary systematically across traits, reflecting a spectrum from highly integrated metrics — such as population growth rate, which averages over many transitions and should be buffered against uncertainty in any single element — to traits that depend on long-term survivorship inferred indirectly via age-from-stage methods, such as life expectancy and mortality shape, where small errors in late-stage survival can amplify into large errors in derived quantities. We structure our three analyses to bracket this spectrum deliberately. The focal quantities are mature life expectancy, the shape of the mortality trajectory, log population growth rate, and recruitment-climate regression coefficients. Because COMPADRE does not routinely include transition-level sample sizes, our analysis is restricted to the subset for which these data could be assembled (695 MPMs from 31 studies; details in Methods). We illustrate trait-dependent uncertainty effects using a multi-species comparative analysis of life expectancy-shape relationships (analysis 1), a single-species time-series analysis of weather effects on recruitment (analysis 2), and a multi-site extension of the same climate-demography framework (analysis 3), and use these to identify diagnostic features that help researchers assess robustness in their own work.</w:t>
       </w:r>
     </w:p>
     <w:bookmarkEnd w:id="25"/>
@@ -299,7 +299,7 @@
         <w:pStyle w:val="FirstParagraph"/>
       </w:pPr>
       <w:r>
-        <w:t xml:space="preserve">We used COMPADRE version 6.26.3.0 (created Mar_11_2026) to identify an initial group of 91 studies from which we sought data. The initial search criteria were: studies published from 2010 onwards; species of common perennial growth forms (herbaceous, shrub, tree, palm, and succulent); wild populations not subjected to experimental treatments; and MPMs with three or more stage classes and a one-year projection interval. Of these, we obtained the data required to model sampling uncertainty for 28: most exclusions reflected insufficient reporting of transition-specific sample sizes, and a small number used estimation methods incompatible with our bootstrapping approach (e.g. mark-recapture or multi-stage vital rate products). We cannot rule out selection bias, but have no strong reason to expect systematic differences between included and excluded studies. The 28 studies yielded 298 MPMs for 73 populations of 27 species. We supplemented this set with 5 additional studies published before 2010 for which we had previously obtained data (targeted based on a criterion of at least 4 years of temporal replication), giving a final set of 33 studies representing 325 MPMs for 82 populations of 32 species.</w:t>
+        <w:t xml:space="preserve">We used an earlier version of COMPADRE to identify an initial group of 86 studies from which we sought data, applying the following criteria: studies published from 2010 onwards; species of common perennial growth forms (herbaceous, shrub, tree, palm, and succulent); wild populations not subjected to experimental treatments; and MPMs with three or more stage classes and a one-year projection interval. Data collection and analysis were subsequently conducted using COMPADRE version 6.26.3.0 (created Mar_11_2026). Of the 86 initially identified studies, we obtained the data required to model sampling uncertainty for 26: most exclusions reflected insufficient reporting of transition-specific sample sizes, and a small number used estimation methods incompatible with our bootstrapping approach (e.g. mark-recapture or multi-stage vital rate products). We cannot rule out selection bias, but have no strong reason to expect systematic differences between included and excluded studies. The 26 studies yielded 580 MPMs for 116 populations of 25 species. We supplemented this set with 5 additional studies published before 2010 for which we had previously obtained data (targeted based on a criterion of at least 4 years of temporal replication), giving a final set of 31 studies representing 695 MPMs for 132 populations of 30 species.</w:t>
       </w:r>
     </w:p>
     <w:bookmarkEnd w:id="27"/>
@@ -4082,7 +4082,7 @@
         <w:pStyle w:val="FirstParagraph"/>
       </w:pPr>
       <w:r>
-        <w:t xml:space="preserve">We fit the models described above using RStan (Stan Development Team 2025; Carpenter et al. 2017), with priors and settings as described in Supplementary Methods section S1.4.</w:t>
+        <w:t xml:space="preserve">For these models, we used priors and settings as described in Supplementary Methods section S1.4.</w:t>
       </w:r>
     </w:p>
     <w:p>
@@ -5774,7 +5774,7 @@
         </m:sSub>
       </m:oMath>
       <w:r>
-        <w:t xml:space="preserve">), rather than a single model intercept as before. We fit the above-described models again using RStan, with priors and settings as described in Supplementary Methods section S1.4.</w:t>
+        <w:t xml:space="preserve">), rather than a single model intercept as before. We fit the above-described models again, with priors and settings as described in Supplementary Methods section S1.4.</w:t>
       </w:r>
     </w:p>
     <w:p>
@@ -5973,7 +5973,7 @@
         <w:pStyle w:val="BodyText"/>
       </w:pPr>
       <w:r>
-        <w:t xml:space="preserve">All analyses were run in R (4.5.2) using RStan (2.32.7), with data handling and plotting in tidyverse packages.</w:t>
+        <w:t xml:space="preserve">All analyses were run in R (4.5.3) using RStan (2.32.7), with data handling and plotting in tidyverse packages.</w:t>
       </w:r>
     </w:p>
     <w:bookmarkEnd w:id="33"/>
@@ -6130,7 +6130,16 @@
         <w:t xml:space="preserve">5</w:t>
       </w:r>
       <w:r>
-        <w:t xml:space="preserve">C), temperature coefficients were estimable for stages 2 and 3; for stage 1 we show a descriptive open-circle marker at mean survival across years, and for stage 4 (all years at 100% survival) we show a descriptive open-circle marker at survival = 1, both without interval bars.</w:t>
+        <w:t xml:space="preserve">C), temperature coefficients were estimable for stages 2 and 3; for stage 1 we show a descriptive open-circle marker at mean survival across years, and for stage 4 (all years at 100% survival) we show a descriptive open-circle marker at survival = 1, both without interval bars. This is analogous to the pattern in Figure</w:t>
+      </w:r>
+      <w:r>
+        <w:t xml:space="preserve"> </w:t>
+      </w:r>
+      <w:r>
+        <w:t xml:space="preserve">4</w:t>
+      </w:r>
+      <w:r>
+        <w:t xml:space="preserve">: once sampling variation in the annual survival estimates is modelled explicitly, part of the apparent between-year spread is reallocated from biological signal to measurement noise, which can yield more precise coefficient estimates.</w:t>
       </w:r>
     </w:p>
     <w:bookmarkEnd w:id="37"/>
@@ -6354,7 +6363,7 @@
         <w:pStyle w:val="FirstParagraph"/>
       </w:pPr>
       <w:r>
-        <w:t xml:space="preserve">Incorporating transition-rate sampling uncertainty into analyses of published MPMs remains challenging, primarily because the data required to reconstruct sampling distributions are rarely reported. Of the 91 source publications we initially targeted, only a small subset provided sufficient information to model uncertainty in survival or reproductive transitions. Improved reporting of transition-specific sample sizes or standard errors, particularly on the scale of the linear predictor, would greatly enhance future researchers’ ability to assess robustness and propagate uncertainty where necessary (see Supplementary Methods section S1.7 for detailed recommendations). At the same time, the absence of a single, universally</w:t>
+        <w:t xml:space="preserve">Incorporating transition-rate sampling uncertainty into analyses of published MPMs remains challenging, primarily because the data required to reconstruct sampling distributions are rarely reported. Of the 86 source publications we initially targeted, only a small subset provided sufficient information to model uncertainty in survival or reproductive transitions. Improved reporting of transition-specific sample sizes or standard errors, particularly on the scale of the linear predictor, would greatly enhance future researchers’ ability to assess robustness and propagate uncertainty where necessary (see Supplementary Methods section S1.7 for detailed recommendations). At the same time, the absence of a single, universally</w:t>
       </w:r>
       <w:r>
         <w:t xml:space="preserve"> </w:t>
@@ -6437,7 +6446,7 @@
         <w:pStyle w:val="FirstParagraph"/>
       </w:pPr>
       <w:r>
-        <w:t xml:space="preserve">ORJ conceived and designed the study, curated data from the COMPADRE database and data provided by authors of papers selected as case studies, conducted the analysis, and wrote the first draft of the manuscript. EGS contributed to conceptualization and interpretation of results, and reviewed and edited the manuscript. Both authors approved the final version for submission.</w:t>
+        <w:t xml:space="preserve">ORJ conceived and designed the study, curated data from the COMPADRE database and data provided by authors of papers selected for the analyses, conducted the analysis, and wrote the first draft of the manuscript. EGS contributed to conceptualization and interpretation of results, and reviewed and edited the manuscript. Both authors approved the final version for submission.</w:t>
       </w:r>
     </w:p>
     <w:bookmarkEnd w:id="48"/>
@@ -6459,7 +6468,7 @@
       </w:r>
     </w:p>
     <w:bookmarkEnd w:id="49"/>
-    <w:bookmarkStart w:id="50" w:name="data-availability"/>
+    <w:bookmarkStart w:id="51" w:name="data-availability"/>
     <w:p>
       <w:pPr>
         <w:pStyle w:val="Heading1"/>
@@ -6473,11 +6482,25 @@
         <w:pStyle w:val="FirstParagraph"/>
       </w:pPr>
       <w:r>
-        <w:t xml:space="preserve">Data and code required to reproduce our analyses are archived on Zenodo [DOI to be inserted].</w:t>
-      </w:r>
-    </w:p>
-    <w:bookmarkEnd w:id="50"/>
-    <w:bookmarkStart w:id="51" w:name="supplementary-materials"/>
+        <w:t xml:space="preserve">Data and code required to reproduce our analyses are archived on Zenodo:</w:t>
+      </w:r>
+      <w:r>
+        <w:t xml:space="preserve"> </w:t>
+      </w:r>
+      <w:hyperlink r:id="rId50">
+        <w:r>
+          <w:rPr>
+            <w:rStyle w:val="Hyperlink"/>
+          </w:rPr>
+          <w:t xml:space="preserve">https://doi.org/10.5281/zenodo.19474729</w:t>
+        </w:r>
+      </w:hyperlink>
+      <w:r>
+        <w:t xml:space="preserve">.</w:t>
+      </w:r>
+    </w:p>
+    <w:bookmarkEnd w:id="51"/>
+    <w:bookmarkStart w:id="52" w:name="supplementary-materials"/>
     <w:p>
       <w:pPr>
         <w:pStyle w:val="Heading1"/>
@@ -6972,8 +6995,8 @@
         <w:br w:type="page"/>
       </w:r>
     </w:p>
-    <w:bookmarkEnd w:id="51"/>
-    <w:bookmarkStart w:id="90" w:name="references"/>
+    <w:bookmarkEnd w:id="52"/>
+    <w:bookmarkStart w:id="91" w:name="references"/>
     <w:p>
       <w:pPr>
         <w:pStyle w:val="Heading1"/>
@@ -7005,7 +7028,7 @@
       <w:r>
         <w:t xml:space="preserve"> </w:t>
       </w:r>
-      <w:hyperlink r:id="rId52">
+      <w:hyperlink r:id="rId53">
         <w:r>
           <w:rPr>
             <w:rStyle w:val="Hyperlink"/>
@@ -7037,7 +7060,7 @@
       <w:r>
         <w:t xml:space="preserve"> </w:t>
       </w:r>
-      <w:hyperlink r:id="rId53">
+      <w:hyperlink r:id="rId54">
         <w:r>
           <w:rPr>
             <w:rStyle w:val="Hyperlink"/>
@@ -7069,7 +7092,7 @@
       <w:r>
         <w:t xml:space="preserve"> </w:t>
       </w:r>
-      <w:hyperlink r:id="rId54">
+      <w:hyperlink r:id="rId55">
         <w:r>
           <w:rPr>
             <w:rStyle w:val="Hyperlink"/>
@@ -7101,7 +7124,7 @@
       <w:r>
         <w:t xml:space="preserve"> </w:t>
       </w:r>
-      <w:hyperlink r:id="rId55">
+      <w:hyperlink r:id="rId56">
         <w:r>
           <w:rPr>
             <w:rStyle w:val="Hyperlink"/>
@@ -7154,7 +7177,7 @@
       <w:r>
         <w:t xml:space="preserve"> </w:t>
       </w:r>
-      <w:hyperlink r:id="rId56">
+      <w:hyperlink r:id="rId57">
         <w:r>
           <w:rPr>
             <w:rStyle w:val="Hyperlink"/>
@@ -7186,7 +7209,7 @@
       <w:r>
         <w:t xml:space="preserve"> </w:t>
       </w:r>
-      <w:hyperlink r:id="rId57">
+      <w:hyperlink r:id="rId58">
         <w:r>
           <w:rPr>
             <w:rStyle w:val="Hyperlink"/>
@@ -7231,7 +7254,7 @@
       <w:r>
         <w:t xml:space="preserve"> </w:t>
       </w:r>
-      <w:hyperlink r:id="rId58">
+      <w:hyperlink r:id="rId59">
         <w:r>
           <w:rPr>
             <w:rStyle w:val="Hyperlink"/>
@@ -7263,7 +7286,7 @@
       <w:r>
         <w:t xml:space="preserve"> </w:t>
       </w:r>
-      <w:hyperlink r:id="rId59">
+      <w:hyperlink r:id="rId60">
         <w:r>
           <w:rPr>
             <w:rStyle w:val="Hyperlink"/>
@@ -7295,7 +7318,7 @@
       <w:r>
         <w:t xml:space="preserve"> </w:t>
       </w:r>
-      <w:hyperlink r:id="rId60">
+      <w:hyperlink r:id="rId61">
         <w:r>
           <w:rPr>
             <w:rStyle w:val="Hyperlink"/>
@@ -7327,7 +7350,7 @@
       <w:r>
         <w:t xml:space="preserve"> </w:t>
       </w:r>
-      <w:hyperlink r:id="rId61">
+      <w:hyperlink r:id="rId62">
         <w:r>
           <w:rPr>
             <w:rStyle w:val="Hyperlink"/>
@@ -7359,7 +7382,7 @@
       <w:r>
         <w:t xml:space="preserve"> </w:t>
       </w:r>
-      <w:hyperlink r:id="rId62">
+      <w:hyperlink r:id="rId63">
         <w:r>
           <w:rPr>
             <w:rStyle w:val="Hyperlink"/>
@@ -7391,7 +7414,7 @@
       <w:r>
         <w:t xml:space="preserve"> </w:t>
       </w:r>
-      <w:hyperlink r:id="rId63">
+      <w:hyperlink r:id="rId64">
         <w:r>
           <w:rPr>
             <w:rStyle w:val="Hyperlink"/>
@@ -7423,7 +7446,7 @@
       <w:r>
         <w:t xml:space="preserve"> </w:t>
       </w:r>
-      <w:hyperlink r:id="rId64">
+      <w:hyperlink r:id="rId65">
         <w:r>
           <w:rPr>
             <w:rStyle w:val="Hyperlink"/>
@@ -7455,7 +7478,7 @@
       <w:r>
         <w:t xml:space="preserve"> </w:t>
       </w:r>
-      <w:hyperlink r:id="rId65">
+      <w:hyperlink r:id="rId66">
         <w:r>
           <w:rPr>
             <w:rStyle w:val="Hyperlink"/>
@@ -7487,7 +7510,7 @@
       <w:r>
         <w:t xml:space="preserve"> </w:t>
       </w:r>
-      <w:hyperlink r:id="rId66">
+      <w:hyperlink r:id="rId67">
         <w:r>
           <w:rPr>
             <w:rStyle w:val="Hyperlink"/>
@@ -7519,7 +7542,7 @@
       <w:r>
         <w:t xml:space="preserve"> </w:t>
       </w:r>
-      <w:hyperlink r:id="rId67">
+      <w:hyperlink r:id="rId68">
         <w:r>
           <w:rPr>
             <w:rStyle w:val="Hyperlink"/>
@@ -7551,7 +7574,7 @@
       <w:r>
         <w:t xml:space="preserve"> </w:t>
       </w:r>
-      <w:hyperlink r:id="rId68">
+      <w:hyperlink r:id="rId69">
         <w:r>
           <w:rPr>
             <w:rStyle w:val="Hyperlink"/>
@@ -7583,7 +7606,7 @@
       <w:r>
         <w:t xml:space="preserve"> </w:t>
       </w:r>
-      <w:hyperlink r:id="rId69">
+      <w:hyperlink r:id="rId70">
         <w:r>
           <w:rPr>
             <w:rStyle w:val="Hyperlink"/>
@@ -7615,7 +7638,7 @@
       <w:r>
         <w:t xml:space="preserve"> </w:t>
       </w:r>
-      <w:hyperlink r:id="rId70">
+      <w:hyperlink r:id="rId71">
         <w:r>
           <w:rPr>
             <w:rStyle w:val="Hyperlink"/>
@@ -7647,7 +7670,7 @@
       <w:r>
         <w:t xml:space="preserve"> </w:t>
       </w:r>
-      <w:hyperlink r:id="rId71">
+      <w:hyperlink r:id="rId72">
         <w:r>
           <w:rPr>
             <w:rStyle w:val="Hyperlink"/>
@@ -7679,7 +7702,7 @@
       <w:r>
         <w:t xml:space="preserve"> </w:t>
       </w:r>
-      <w:hyperlink r:id="rId72">
+      <w:hyperlink r:id="rId73">
         <w:r>
           <w:rPr>
             <w:rStyle w:val="Hyperlink"/>
@@ -7740,7 +7763,7 @@
       <w:r>
         <w:t xml:space="preserve"> </w:t>
       </w:r>
-      <w:hyperlink r:id="rId73">
+      <w:hyperlink r:id="rId74">
         <w:r>
           <w:rPr>
             <w:rStyle w:val="Hyperlink"/>
@@ -7785,7 +7808,7 @@
       <w:r>
         <w:t xml:space="preserve"> </w:t>
       </w:r>
-      <w:hyperlink r:id="rId74">
+      <w:hyperlink r:id="rId75">
         <w:r>
           <w:rPr>
             <w:rStyle w:val="Hyperlink"/>
@@ -7817,7 +7840,7 @@
       <w:r>
         <w:t xml:space="preserve"> </w:t>
       </w:r>
-      <w:hyperlink r:id="rId75">
+      <w:hyperlink r:id="rId76">
         <w:r>
           <w:rPr>
             <w:rStyle w:val="Hyperlink"/>
@@ -7836,7 +7859,7 @@
       <w:r>
         <w:t xml:space="preserve"> </w:t>
       </w:r>
-      <w:hyperlink r:id="rId76">
+      <w:hyperlink r:id="rId77">
         <w:r>
           <w:rPr>
             <w:rStyle w:val="Hyperlink"/>
@@ -7868,7 +7891,7 @@
       <w:r>
         <w:t xml:space="preserve"> </w:t>
       </w:r>
-      <w:hyperlink r:id="rId77">
+      <w:hyperlink r:id="rId78">
         <w:r>
           <w:rPr>
             <w:rStyle w:val="Hyperlink"/>
@@ -7900,7 +7923,7 @@
       <w:r>
         <w:t xml:space="preserve"> </w:t>
       </w:r>
-      <w:hyperlink r:id="rId78">
+      <w:hyperlink r:id="rId79">
         <w:r>
           <w:rPr>
             <w:rStyle w:val="Hyperlink"/>
@@ -7919,7 +7942,7 @@
       <w:r>
         <w:t xml:space="preserve"> </w:t>
       </w:r>
-      <w:hyperlink r:id="rId79">
+      <w:hyperlink r:id="rId80">
         <w:r>
           <w:rPr>
             <w:rStyle w:val="Hyperlink"/>
@@ -7954,7 +7977,7 @@
       <w:r>
         <w:t xml:space="preserve"> </w:t>
       </w:r>
-      <w:hyperlink r:id="rId80">
+      <w:hyperlink r:id="rId81">
         <w:r>
           <w:rPr>
             <w:rStyle w:val="Hyperlink"/>
@@ -7986,7 +8009,7 @@
       <w:r>
         <w:t xml:space="preserve"> </w:t>
       </w:r>
-      <w:hyperlink r:id="rId81">
+      <w:hyperlink r:id="rId82">
         <w:r>
           <w:rPr>
             <w:rStyle w:val="Hyperlink"/>
@@ -8018,7 +8041,7 @@
       <w:r>
         <w:t xml:space="preserve"> </w:t>
       </w:r>
-      <w:hyperlink r:id="rId82">
+      <w:hyperlink r:id="rId83">
         <w:r>
           <w:rPr>
             <w:rStyle w:val="Hyperlink"/>
@@ -8050,7 +8073,7 @@
       <w:r>
         <w:t xml:space="preserve"> </w:t>
       </w:r>
-      <w:hyperlink r:id="rId83">
+      <w:hyperlink r:id="rId84">
         <w:r>
           <w:rPr>
             <w:rStyle w:val="Hyperlink"/>
@@ -8082,7 +8105,7 @@
       <w:r>
         <w:t xml:space="preserve"> </w:t>
       </w:r>
-      <w:hyperlink r:id="rId84">
+      <w:hyperlink r:id="rId85">
         <w:r>
           <w:rPr>
             <w:rStyle w:val="Hyperlink"/>
@@ -8114,7 +8137,7 @@
       <w:r>
         <w:t xml:space="preserve"> </w:t>
       </w:r>
-      <w:hyperlink r:id="rId85">
+      <w:hyperlink r:id="rId86">
         <w:r>
           <w:rPr>
             <w:rStyle w:val="Hyperlink"/>
@@ -8133,7 +8156,7 @@
       <w:r>
         <w:t xml:space="preserve"> </w:t>
       </w:r>
-      <w:hyperlink r:id="rId86">
+      <w:hyperlink r:id="rId87">
         <w:r>
           <w:rPr>
             <w:rStyle w:val="Hyperlink"/>
@@ -8144,7 +8167,7 @@
       <w:r>
         <w:t xml:space="preserve"> </w:t>
       </w:r>
-      <w:hyperlink r:id="rId87">
+      <w:hyperlink r:id="rId88">
         <w:r>
           <w:rPr>
             <w:rStyle w:val="Hyperlink"/>
@@ -8176,7 +8199,7 @@
       <w:r>
         <w:t xml:space="preserve"> </w:t>
       </w:r>
-      <w:hyperlink r:id="rId88">
+      <w:hyperlink r:id="rId89">
         <w:r>
           <w:rPr>
             <w:rStyle w:val="Hyperlink"/>
@@ -8208,7 +8231,7 @@
       <w:r>
         <w:t xml:space="preserve"> </w:t>
       </w:r>
-      <w:hyperlink r:id="rId89">
+      <w:hyperlink r:id="rId90">
         <w:r>
           <w:rPr>
             <w:rStyle w:val="Hyperlink"/>
@@ -8222,8 +8245,8 @@
         <w:br w:type="page"/>
       </w:r>
     </w:p>
-    <w:bookmarkEnd w:id="90"/>
-    <w:bookmarkStart w:id="92" w:name="tables"/>
+    <w:bookmarkEnd w:id="91"/>
+    <w:bookmarkStart w:id="93" w:name="tables"/>
     <w:p>
       <w:pPr>
         <w:pStyle w:val="Heading1"/>
@@ -8236,8 +8259,8 @@
       <w:pPr>
         <w:pStyle w:val="TableCaption"/>
       </w:pPr>
-      <w:bookmarkStart w:id="91" w:name="tab:table-case1-var"/>
-      <w:bookmarkEnd w:id="91"/>
+      <w:bookmarkStart w:id="92" w:name="tab:table-case1-var"/>
+      <w:bookmarkEnd w:id="92"/>
       <w:r>
         <w:t xml:space="preserve">Table 1:</w:t>
       </w:r>
@@ -9063,8 +9086,8 @@
         <w:br w:type="page"/>
       </w:r>
     </w:p>
-    <w:bookmarkEnd w:id="92"/>
-    <w:bookmarkStart w:id="117" w:name="figures"/>
+    <w:bookmarkEnd w:id="93"/>
+    <w:bookmarkStart w:id="118" w:name="figures"/>
     <w:p>
       <w:pPr>
         <w:pStyle w:val="Heading1"/>
@@ -9082,18 +9105,18 @@
           <wp:inline>
             <wp:extent cx="5727700" cy="1908334"/>
             <wp:effectExtent b="0" l="0" r="0" t="0"/>
-            <wp:docPr descr="Figure 1: Sampling distributions of transition rates for the focal single-MPM example (Agrimonia eupatoria, population B), showing transition rates as reported in COMPADRE (A), the underlying transition counts used for estimation (B), and bootstrap-based sampling distributions (C). In panel C, green density ribbons show transition-rate sampling distributions, red dashed vertical lines show point estimates, and grey dotted vertical lines show posterior medians. Transition rates are probabilities (bounded 0-1). Together, these panels show that several matrix elements are weakly estimated from finite samples." title="" id="94" name="Picture"/>
+            <wp:docPr descr="Figure 1: Sampling distributions of transition rates for the focal single-MPM example (Agrimonia eupatoria, population B), showing transition rates as reported in COMPADRE (A), the underlying transition counts used for estimation (B), and bootstrap-based sampling distributions (C). In panel C, green density ribbons show transition-rate sampling distributions, red dashed vertical lines show point estimates, and grey dotted vertical lines show posterior medians. Transition rates are probabilities (bounded 0-1). Together, these panels show that several matrix elements are weakly estimated from finite samples." title="" id="95" name="Picture"/>
             <a:graphic>
               <a:graphicData uri="http://schemas.openxmlformats.org/drawingml/2006/picture">
                 <pic:pic>
                   <pic:nvPicPr>
-                    <pic:cNvPr descr="../../figures/Figure_1_transition_rates_single_mpm.png" id="95" name="Picture"/>
+                    <pic:cNvPr descr="../../figures/Figure_1_transition_rates_single_mpm.png" id="96" name="Picture"/>
                     <pic:cNvPicPr>
                       <a:picLocks noChangeArrowheads="1" noChangeAspect="1"/>
                     </pic:cNvPicPr>
                   </pic:nvPicPr>
                   <pic:blipFill>
-                    <a:blip r:embed="rId93"/>
+                    <a:blip r:embed="rId94"/>
                     <a:stretch>
                       <a:fillRect/>
                     </a:stretch>
@@ -9124,8 +9147,8 @@
       <w:pPr>
         <w:pStyle w:val="ImageCaption"/>
       </w:pPr>
-      <w:bookmarkStart w:id="96" w:name="fig:fig-main-1a"/>
-      <w:bookmarkEnd w:id="96"/>
+      <w:bookmarkStart w:id="97" w:name="fig:fig-main-1a"/>
+      <w:bookmarkEnd w:id="97"/>
       <w:r>
         <w:t xml:space="preserve">Figure 1: Sampling distributions of transition rates for the focal single-MPM example (</w:t>
       </w:r>
@@ -9154,18 +9177,18 @@
           <wp:inline>
             <wp:extent cx="5727700" cy="2355769"/>
             <wp:effectExtent b="0" l="0" r="0" t="0"/>
-            <wp:docPr descr="Figure 2: Sampling distributions of demographic quantities derived from the focal single MPM, including population growth rate (λ), damping ratio (ρ), generation time (T), and life expectancy (l₀). Orange density ribbons show derived-quantity sampling distributions; red dashed vertical lines show point estimates; grey dotted vertical lines show posterior medians. Quantities are shown on their natural scales (T and l₀ are in years). Uncertainty in transition rates propagates to substantial uncertainty in these derived parameters, with the largest spread in quantities that depend on long-term survivorship and reproduction." title="" id="98" name="Picture"/>
+            <wp:docPr descr="Figure 2: Sampling distributions of demographic quantities derived from the focal single MPM, including population growth rate (λ), damping ratio (ρ), generation time (T), and life expectancy (l₀). Orange density ribbons show derived-quantity sampling distributions; red dashed vertical lines show point estimates; grey dotted vertical lines show posterior medians. Quantities are shown on their natural scales (T and l₀ are in years). Uncertainty in transition rates propagates to substantial uncertainty in these derived parameters, with the largest spread in quantities that depend on long-term survivorship and reproduction." title="" id="99" name="Picture"/>
             <a:graphic>
               <a:graphicData uri="http://schemas.openxmlformats.org/drawingml/2006/picture">
                 <pic:pic>
                   <pic:nvPicPr>
-                    <pic:cNvPr descr="../../figures/Figure_2_derived_parameters_single_mpm.png" id="99" name="Picture"/>
+                    <pic:cNvPr descr="../../figures/Figure_2_derived_parameters_single_mpm.png" id="100" name="Picture"/>
                     <pic:cNvPicPr>
                       <a:picLocks noChangeArrowheads="1" noChangeAspect="1"/>
                     </pic:cNvPicPr>
                   </pic:nvPicPr>
                   <pic:blipFill>
-                    <a:blip r:embed="rId97"/>
+                    <a:blip r:embed="rId98"/>
                     <a:stretch>
                       <a:fillRect/>
                     </a:stretch>
@@ -9196,8 +9219,8 @@
       <w:pPr>
         <w:pStyle w:val="ImageCaption"/>
       </w:pPr>
-      <w:bookmarkStart w:id="100" w:name="fig:fig-main-1b"/>
-      <w:bookmarkEnd w:id="100"/>
+      <w:bookmarkStart w:id="101" w:name="fig:fig-main-1b"/>
+      <w:bookmarkEnd w:id="101"/>
       <w:r>
         <w:t xml:space="preserve">Figure 2: Sampling distributions of demographic quantities derived from the focal single MPM, including population growth rate (λ), damping ratio (ρ), generation time (T), and life expectancy (l₀). Orange density ribbons show derived-quantity sampling distributions; red dashed vertical lines show point estimates; grey dotted vertical lines show posterior medians. Quantities are shown on their natural scales (T and l₀ are in years). Uncertainty in transition rates propagates to substantial uncertainty in these derived parameters, with the largest spread in quantities that depend on long-term survivorship and reproduction.</w:t>
       </w:r>
@@ -9216,18 +9239,18 @@
           <wp:inline>
             <wp:extent cx="3247802" cy="4440497"/>
             <wp:effectExtent b="0" l="0" r="0" t="0"/>
-            <wp:docPr descr="Figure 3: Analysis 1 comparison of point estimates versus sampling-distribution summaries for population-level life expectancy and shape. Panel A shows mortality-trajectory shape, and panel B shows mature life expectancy (years). Purple distributions/points correspond to estimates from matrix point estimates, and green distributions/points correspond to uncertainty-aware summaries from transition-rate sampling distributions. The figure shows systematic shifts and shrinkage in extreme values when sampling uncertainty is propagated." title="" id="102" name="Picture"/>
+            <wp:docPr descr="Figure 3: Analysis 1 comparison of point estimates versus sampling-distribution summaries for population-level life expectancy and shape. Panel A shows mortality-trajectory shape, and panel B shows mature life expectancy (years). Purple distributions/points correspond to estimates from matrix point estimates, and green distributions/points correspond to uncertainty-aware summaries from transition-rate sampling distributions. The figure shows systematic shifts and shrinkage in extreme values when sampling uncertainty is propagated." title="" id="103" name="Picture"/>
             <a:graphic>
               <a:graphicData uri="http://schemas.openxmlformats.org/drawingml/2006/picture">
                 <pic:pic>
                   <pic:nvPicPr>
-                    <pic:cNvPr descr="../../figures/Figure_3_analysis1_point_vs_sampling_distributions.png" id="103" name="Picture"/>
+                    <pic:cNvPr descr="../../figures/Figure_3_analysis1_point_vs_sampling_distributions.png" id="104" name="Picture"/>
                     <pic:cNvPicPr>
                       <a:picLocks noChangeArrowheads="1" noChangeAspect="1"/>
                     </pic:cNvPicPr>
                   </pic:nvPicPr>
                   <pic:blipFill>
-                    <a:blip r:embed="rId101"/>
+                    <a:blip r:embed="rId102"/>
                     <a:stretch>
                       <a:fillRect/>
                     </a:stretch>
@@ -9258,8 +9281,8 @@
       <w:pPr>
         <w:pStyle w:val="ImageCaption"/>
       </w:pPr>
-      <w:bookmarkStart w:id="104" w:name="fig:fig-main-2"/>
-      <w:bookmarkEnd w:id="104"/>
+      <w:bookmarkStart w:id="105" w:name="fig:fig-main-2"/>
+      <w:bookmarkEnd w:id="105"/>
       <w:r>
         <w:t xml:space="preserve">Figure 3: Analysis 1 comparison of point estimates versus sampling-distribution summaries for population-level life expectancy and shape. Panel A shows mortality-trajectory shape, and panel B shows mature life expectancy (years). Purple distributions/points correspond to estimates from matrix point estimates, and green distributions/points correspond to uncertainty-aware summaries from transition-rate sampling distributions. The figure shows systematic shifts and shrinkage in extreme values when sampling uncertainty is propagated.</w:t>
       </w:r>
@@ -9278,18 +9301,18 @@
           <wp:inline>
             <wp:extent cx="5727700" cy="2832853"/>
             <wp:effectExtent b="0" l="0" r="0" t="0"/>
-            <wp:docPr descr="Figure 4: Analysis 1 relationship between life expectancy and shape under models with and without sampling uncertainty propagation. In panel A, purple points/line/ribbon show the model using point estimates. Green crosses/line/ribbon show the uncertainty-aware model; crosses are centred on sampling-distribution medians with horizontal and vertical bars showing 95% intervals. The displacement between faint reference points and crosses indicates that propagated sampling distributions can shift central tendency away from point estimates, consistent with the offsets between dashed lines and density peaks in Figure 3. Axes are mature life expectancy (years, log scale) and mortality-trajectory shape. Panel B shows posterior densities for the slope parameter β (unit change in shape per unit change in log life expectancy). This figure shows that accounting for sampling uncertainty shifts posterior support towards a positive association." title="" id="106" name="Picture"/>
+            <wp:docPr descr="Figure 4: Analysis 1 relationship between life expectancy and shape under models with and without sampling uncertainty propagation. In panel A, purple points/line/ribbon show the model using point estimates. Green crosses/line/ribbon show the uncertainty-aware model; crosses are centred on sampling-distribution medians with horizontal and vertical bars showing 95% intervals. The displacement between faint reference points and crosses indicates that propagated sampling distributions can shift central tendency away from point estimates, consistent with the offsets between dashed lines and density peaks in Figure 3. Axes are mature life expectancy (years, log scale) and mortality-trajectory shape. Panel B shows posterior densities for the slope parameter β (unit change in shape per unit change in log life expectancy). This figure shows that accounting for sampling uncertainty shifts posterior support towards a positive association." title="" id="107" name="Picture"/>
             <a:graphic>
               <a:graphicData uri="http://schemas.openxmlformats.org/drawingml/2006/picture">
                 <pic:pic>
                   <pic:nvPicPr>
-                    <pic:cNvPr descr="../../figures/Figure_4_analysis1_life_expectancy_shape_relationship.png" id="107" name="Picture"/>
+                    <pic:cNvPr descr="../../figures/Figure_4_analysis1_life_expectancy_shape_relationship.png" id="108" name="Picture"/>
                     <pic:cNvPicPr>
                       <a:picLocks noChangeArrowheads="1" noChangeAspect="1"/>
                     </pic:cNvPicPr>
                   </pic:nvPicPr>
                   <pic:blipFill>
-                    <a:blip r:embed="rId105"/>
+                    <a:blip r:embed="rId106"/>
                     <a:stretch>
                       <a:fillRect/>
                     </a:stretch>
@@ -9320,8 +9343,8 @@
       <w:pPr>
         <w:pStyle w:val="ImageCaption"/>
       </w:pPr>
-      <w:bookmarkStart w:id="108" w:name="fig:fig-main-3"/>
-      <w:bookmarkEnd w:id="108"/>
+      <w:bookmarkStart w:id="109" w:name="fig:fig-main-3"/>
+      <w:bookmarkEnd w:id="109"/>
       <w:r>
         <w:t xml:space="preserve">Figure 4: Analysis 1 relationship between life expectancy and shape under models with and without sampling uncertainty propagation. In panel A, purple points/line/ribbon show the model using point estimates. Green crosses/line/ribbon show the uncertainty-aware model; crosses are centred on sampling-distribution medians with horizontal and vertical bars showing 95% intervals. The displacement between faint reference points and crosses indicates that propagated sampling distributions can shift central tendency away from point estimates, consistent with the offsets between dashed lines and density peaks in Figure</w:t>
       </w:r>
@@ -9349,18 +9372,18 @@
           <wp:inline>
             <wp:extent cx="3247802" cy="7043020"/>
             <wp:effectExtent b="0" l="0" r="0" t="0"/>
-            <wp:docPr descr="Figure 5: Analysis 2 climate effects on recruitment and stage-specific survival in Silene spaldingii. Panels A-B show monthly-lag and spring-temperature recruitment models for point-estimate (purple) and uncertainty-aware (green) formulations, with similar posterior coefficient estimates and interval widths. In panel A, y-values are temperature coefficients b for monthly temperature deviations (months before survey on the x-axis). In panel B, recruitment is seedlings per reproductive plant and spring temperature is February-April temperature deviation. Panel C shows stage-specific survival-temperature coefficients on the logit scale (beta) where estimable (stages 2-3). Open circles in panel C are descriptive markers without interval bars for non-estimable stages: stage 1 shows mean survival across years, and stage 4 shows survival = 1 (100% survival in all usable years)." title="" id="110" name="Picture"/>
+            <wp:docPr descr="Figure 5: Analysis 2 climate effects on recruitment and stage-specific survival in Silene spaldingii. Panels A-B show monthly-lag and spring-temperature recruitment models for point-estimate (purple) and uncertainty-aware (green) formulations, with similar posterior coefficient estimates and interval widths. In panel A, y-values are temperature coefficients b for monthly temperature deviations (months before survey on the x-axis). In panel B, recruitment is seedlings per reproductive plant and spring temperature is February-April temperature deviation. Panel C shows stage-specific survival-temperature coefficients on the logit scale (beta) where estimable (stages 2-3). Open circles in panel C are descriptive markers without interval bars for non-estimable stages: stage 1 shows mean survival across years, and stage 4 shows survival = 1 (100% survival in all usable years)." title="" id="111" name="Picture"/>
             <a:graphic>
               <a:graphicData uri="http://schemas.openxmlformats.org/drawingml/2006/picture">
                 <pic:pic>
                   <pic:nvPicPr>
-                    <pic:cNvPr descr="../../figures/Figure_5_analysis2_climate_effects_recruitment.png" id="111" name="Picture"/>
+                    <pic:cNvPr descr="../../figures/Figure_5_analysis2_climate_effects_recruitment.png" id="112" name="Picture"/>
                     <pic:cNvPicPr>
                       <a:picLocks noChangeArrowheads="1" noChangeAspect="1"/>
                     </pic:cNvPicPr>
                   </pic:nvPicPr>
                   <pic:blipFill>
-                    <a:blip r:embed="rId109"/>
+                    <a:blip r:embed="rId110"/>
                     <a:stretch>
                       <a:fillRect/>
                     </a:stretch>
@@ -9391,8 +9414,8 @@
       <w:pPr>
         <w:pStyle w:val="ImageCaption"/>
       </w:pPr>
-      <w:bookmarkStart w:id="112" w:name="fig:fig-main-4"/>
-      <w:bookmarkEnd w:id="112"/>
+      <w:bookmarkStart w:id="113" w:name="fig:fig-main-4"/>
+      <w:bookmarkEnd w:id="113"/>
       <w:r>
         <w:t xml:space="preserve">Figure 5: Analysis 2 climate effects on recruitment and stage-specific survival in</w:t>
       </w:r>
@@ -9424,18 +9447,18 @@
           <wp:inline>
             <wp:extent cx="5727700" cy="4773682"/>
             <wp:effectExtent b="0" l="0" r="0" t="0"/>
-            <wp:docPr descr="Figure 6: Analysis 3 multisite climate-demography comparison for Astragalus scaphoides. Panel A (Haynes Creek), panel B (McDevitt Creek), and panel C (Sheep Corral Gulch) each show monthly-lag temperature coefficients, recruitment-temperature fits, and stage-specific survival-temperature coefficients for point-estimate (purple) and uncertainty-aware (green) formulations. Recruitment is seedlings per reproductive plant, and stage-specific survival coefficients are on the logit scale (β). Across sites, the two formulations remain closely aligned, showing that among-site ecological differences are larger than differences induced by uncertainty propagation." title="" id="114" name="Picture"/>
+            <wp:docPr descr="Figure 6: Analysis 3 multisite climate-demography comparison for Astragalus scaphoides. Panel A (Haynes Creek), panel B (McDevitt Creek), and panel C (Sheep Corral Gulch) each show monthly-lag temperature coefficients, recruitment-temperature fits, and stage-specific survival-temperature coefficients for point-estimate (purple) and uncertainty-aware (green) formulations. Recruitment is seedlings per reproductive plant, and stage-specific survival coefficients are on the logit scale (β). Across sites, the two formulations remain closely aligned, showing that among-site ecological differences are larger than differences induced by uncertainty propagation." title="" id="115" name="Picture"/>
             <a:graphic>
               <a:graphicData uri="http://schemas.openxmlformats.org/drawingml/2006/picture">
                 <pic:pic>
                   <pic:nvPicPr>
-                    <pic:cNvPr descr="../../figures/Figure_6_analysis3_climate_effects_multisite.png" id="115" name="Picture"/>
+                    <pic:cNvPr descr="../../figures/Figure_6_analysis3_climate_effects_multisite.png" id="116" name="Picture"/>
                     <pic:cNvPicPr>
                       <a:picLocks noChangeArrowheads="1" noChangeAspect="1"/>
                     </pic:cNvPicPr>
                   </pic:nvPicPr>
                   <pic:blipFill>
-                    <a:blip r:embed="rId113"/>
+                    <a:blip r:embed="rId114"/>
                     <a:stretch>
                       <a:fillRect/>
                     </a:stretch>
@@ -9466,8 +9489,8 @@
       <w:pPr>
         <w:pStyle w:val="ImageCaption"/>
       </w:pPr>
-      <w:bookmarkStart w:id="116" w:name="fig:fig-main-5"/>
-      <w:bookmarkEnd w:id="116"/>
+      <w:bookmarkStart w:id="117" w:name="fig:fig-main-5"/>
+      <w:bookmarkEnd w:id="117"/>
       <w:r>
         <w:t xml:space="preserve">Figure 6: Analysis 3 multisite climate-demography comparison for</w:t>
       </w:r>
@@ -9485,7 +9508,7 @@
         <w:t xml:space="preserve">. Panel A (Haynes Creek), panel B (McDevitt Creek), and panel C (Sheep Corral Gulch) each show monthly-lag temperature coefficients, recruitment-temperature fits, and stage-specific survival-temperature coefficients for point-estimate (purple) and uncertainty-aware (green) formulations. Recruitment is seedlings per reproductive plant, and stage-specific survival coefficients are on the logit scale (β). Across sites, the two formulations remain closely aligned, showing that among-site ecological differences are larger than differences induced by uncertainty propagation.</w:t>
       </w:r>
     </w:p>
-    <w:bookmarkEnd w:id="117"/>
+    <w:bookmarkEnd w:id="118"/>
     <w:sectPr>
       <w:footerReference r:id="rId10" w:type="even"/>
       <w:footerReference r:id="rId9" w:type="default"/>

</xml_diff>